<commit_message>
chore: limpieza — eliminar versiones antiguas y subir recursos de portada
</commit_message>
<xml_diff>
--- a/MARATONAIDE ver 4 diagramada.docx
+++ b/MARATONAIDE ver 4 diagramada.docx
@@ -7,6 +7,9 @@
         <w:jc w:val="center"/>
       </w:pPr>
       <w:r>
+        <w:rPr>
+          <w:noProof/>
+        </w:rPr>
         <w:drawing>
           <wp:inline distT="0" distB="0" distL="0" distR="0" wp14:anchorId="0A07E9D5" wp14:editId="5DAB409D">
             <wp:extent cx="3155703" cy="5921313"/>
@@ -46,6 +49,9 @@
     </w:p>
     <w:p>
       <w:r>
+        <w:rPr>
+          <w:noProof/>
+        </w:rPr>
         <w:lastRenderedPageBreak/>
         <w:drawing>
           <wp:inline distT="0" distB="0" distL="0" distR="0" wp14:anchorId="512C5C8B" wp14:editId="2E7E4D3C">
@@ -455,6 +461,11 @@
     <w:sdt>
       <w:sdtPr>
         <w:rPr>
+          <w:rFonts w:ascii="Georgia" w:eastAsia="Georgia" w:hAnsi="Georgia" w:cstheme="minorBidi"/>
+          <w:b w:val="0"/>
+          <w:bCs w:val="0"/>
+          <w:sz w:val="22"/>
+          <w:szCs w:val="22"/>
           <w:lang w:val="es-ES"/>
         </w:rPr>
         <w:id w:val="-2014527319"/>
@@ -463,13 +474,6 @@
           <w:docPartUnique/>
         </w:docPartObj>
       </w:sdtPr>
-      <w:sdtEndPr>
-        <w:rPr>
-          <w:rFonts w:ascii="Georgia" w:eastAsia="Georgia" w:hAnsi="Georgia" w:cstheme="minorBidi"/>
-          <w:sz w:val="22"/>
-          <w:szCs w:val="22"/>
-        </w:rPr>
-      </w:sdtEndPr>
       <w:sdtContent>
         <w:p>
           <w:pPr>
@@ -477,6 +481,7 @@
             <w:jc w:val="center"/>
             <w:rPr>
               <w:rStyle w:val="Ttulo1Car"/>
+              <w:lang w:val="es-CO"/>
             </w:rPr>
           </w:pPr>
           <w:r>
@@ -2221,7 +2226,21 @@
         <w:rPr>
           <w:lang w:val="es-CO"/>
         </w:rPr>
-        <w:t xml:space="preserve">Dos, cero, tres, ocho. El número con el que corrió su única maratón, en los ochentas, en esta misma ciudad. Yo tenía nueve años, y de esa carrera guardo una sola imagen prestada: mi </w:t>
+        <w:t xml:space="preserve">Dos, cero, tres, ocho. El número con el que corrió su única maratón, en </w:t>
+      </w:r>
+      <w:proofErr w:type="gramStart"/>
+      <w:r>
+        <w:rPr>
+          <w:lang w:val="es-CO"/>
+        </w:rPr>
+        <w:t>los ochentas</w:t>
+      </w:r>
+      <w:proofErr w:type="gramEnd"/>
+      <w:r>
+        <w:rPr>
+          <w:lang w:val="es-CO"/>
+        </w:rPr>
+        <w:t xml:space="preserve">, en esta misma ciudad. Yo tenía nueve años, y de esa carrera guardo una sola imagen prestada: mi </w:t>
       </w:r>
       <w:r>
         <w:rPr>
@@ -2566,7 +2585,33 @@
         <w:rPr>
           <w:lang w:val="es-CO"/>
         </w:rPr>
-        <w:t>Se rió. Debía llamarse Montoya, manejaba como si le debieran plata al tiempo. Por la ventanilla pasaba la ciudad a las cinco: buses con las luces internas prendidas y gente dormida adentro; un hombre armando su puesto de café en una esquina, termo, fogón, vasitos alineados.</w:t>
+        <w:t xml:space="preserve">Se </w:t>
+      </w:r>
+      <w:proofErr w:type="spellStart"/>
+      <w:r>
+        <w:rPr>
+          <w:lang w:val="es-CO"/>
+        </w:rPr>
+        <w:t>rió</w:t>
+      </w:r>
+      <w:proofErr w:type="spellEnd"/>
+      <w:r>
+        <w:rPr>
+          <w:lang w:val="es-CO"/>
+        </w:rPr>
+        <w:t>. Debía llamarse Montoya, manejaba como si le debieran plata al tiempo. Por la ventanilla pasaba la ciudad a las c</w:t>
+      </w:r>
+      <w:r>
+        <w:rPr>
+          <w:lang w:val="es-CO"/>
+        </w:rPr>
+        <w:t>uatro</w:t>
+      </w:r>
+      <w:r>
+        <w:rPr>
+          <w:lang w:val="es-CO"/>
+        </w:rPr>
+        <w:t>: buses con las luces internas prendidas y gente dormida adentro; un hombre armando su puesto de café en una esquina, termo, fogón, vasitos alineados.</w:t>
       </w:r>
     </w:p>
     <w:p>
@@ -2721,22 +2766,50 @@
         <w:rPr>
           <w:lang w:val="es-CO"/>
         </w:rPr>
-        <w:t>—Runy.</w:t>
-      </w:r>
-    </w:p>
-    <w:p>
-      <w:pPr>
-        <w:ind w:firstLine="432"/>
-        <w:jc w:val="both"/>
-        <w:rPr>
-          <w:lang w:val="es-CO"/>
-        </w:rPr>
-      </w:pPr>
-      <w:r>
-        <w:rPr>
-          <w:lang w:val="es-CO"/>
-        </w:rPr>
-        <w:t>—¿Runy? —Ahí sí volteó, me midió de arriba abajo con ojos claros de caballo viejo—. ¿Y su mamá qué estaba pensando?</w:t>
+        <w:t>—</w:t>
+      </w:r>
+      <w:proofErr w:type="spellStart"/>
+      <w:r>
+        <w:rPr>
+          <w:lang w:val="es-CO"/>
+        </w:rPr>
+        <w:t>Runy</w:t>
+      </w:r>
+      <w:proofErr w:type="spellEnd"/>
+      <w:r>
+        <w:rPr>
+          <w:lang w:val="es-CO"/>
+        </w:rPr>
+        <w:t>.</w:t>
+      </w:r>
+    </w:p>
+    <w:p>
+      <w:pPr>
+        <w:ind w:firstLine="432"/>
+        <w:jc w:val="both"/>
+        <w:rPr>
+          <w:lang w:val="es-CO"/>
+        </w:rPr>
+      </w:pPr>
+      <w:r>
+        <w:rPr>
+          <w:lang w:val="es-CO"/>
+        </w:rPr>
+        <w:t>—¿</w:t>
+      </w:r>
+      <w:proofErr w:type="spellStart"/>
+      <w:r>
+        <w:rPr>
+          <w:lang w:val="es-CO"/>
+        </w:rPr>
+        <w:t>Runy</w:t>
+      </w:r>
+      <w:proofErr w:type="spellEnd"/>
+      <w:r>
+        <w:rPr>
+          <w:lang w:val="es-CO"/>
+        </w:rPr>
+        <w:t>? —Ahí sí volteó, me midió de arriba abajo con ojos claros de caballo viejo—. ¿Y su mamá qué estaba pensando?</w:t>
       </w:r>
     </w:p>
     <w:p>
@@ -2797,7 +2870,21 @@
         <w:rPr>
           <w:lang w:val="es-CO"/>
         </w:rPr>
-        <w:t>—Pa'l azúcar. Los nervios se comen la glucosa antes que la carrera.</w:t>
+        <w:t>—</w:t>
+      </w:r>
+      <w:proofErr w:type="spellStart"/>
+      <w:r>
+        <w:rPr>
+          <w:lang w:val="es-CO"/>
+        </w:rPr>
+        <w:t>Pa'l</w:t>
+      </w:r>
+      <w:proofErr w:type="spellEnd"/>
+      <w:r>
+        <w:rPr>
+          <w:lang w:val="es-CO"/>
+        </w:rPr>
+        <w:t xml:space="preserve"> azúcar. Los nervios se comen la glucosa antes que la carrera.</w:t>
       </w:r>
     </w:p>
     <w:p>
@@ -2917,7 +3004,35 @@
         <w:rPr>
           <w:lang w:val="es-CO"/>
         </w:rPr>
-        <w:t>—Uno no corre pa' llegar, mijo. Uno corre pa' dejar de huir.</w:t>
+        <w:t xml:space="preserve">—Uno no corre </w:t>
+      </w:r>
+      <w:proofErr w:type="spellStart"/>
+      <w:r>
+        <w:rPr>
+          <w:lang w:val="es-CO"/>
+        </w:rPr>
+        <w:t>pa</w:t>
+      </w:r>
+      <w:proofErr w:type="spellEnd"/>
+      <w:r>
+        <w:rPr>
+          <w:lang w:val="es-CO"/>
+        </w:rPr>
+        <w:t xml:space="preserve">' llegar, mijo. Uno corre </w:t>
+      </w:r>
+      <w:proofErr w:type="spellStart"/>
+      <w:r>
+        <w:rPr>
+          <w:lang w:val="es-CO"/>
+        </w:rPr>
+        <w:t>pa</w:t>
+      </w:r>
+      <w:proofErr w:type="spellEnd"/>
+      <w:r>
+        <w:rPr>
+          <w:lang w:val="es-CO"/>
+        </w:rPr>
+        <w:t>' dejar de huir.</w:t>
       </w:r>
     </w:p>
     <w:p>
@@ -3023,7 +3138,35 @@
         <w:rPr>
           <w:lang w:val="es-CO"/>
         </w:rPr>
-        <w:t>—Yo llevo treinta y una. Maratones, quiero decir —y se rió él primero de su propio chiste—. De kilómetros no llevo nada, gracias a Dios. Eso es trabajo de ustedes los jóvenes.</w:t>
+        <w:t xml:space="preserve">—Yo llevo treinta y una. Maratones, quiero decir —y se </w:t>
+      </w:r>
+      <w:proofErr w:type="spellStart"/>
+      <w:r>
+        <w:rPr>
+          <w:lang w:val="es-CO"/>
+        </w:rPr>
+        <w:t>rió</w:t>
+      </w:r>
+      <w:proofErr w:type="spellEnd"/>
+      <w:r>
+        <w:rPr>
+          <w:lang w:val="es-CO"/>
+        </w:rPr>
+        <w:t xml:space="preserve"> </w:t>
+      </w:r>
+      <w:proofErr w:type="spellStart"/>
+      <w:r>
+        <w:rPr>
+          <w:lang w:val="es-CO"/>
+        </w:rPr>
+        <w:t>él</w:t>
+      </w:r>
+      <w:proofErr w:type="spellEnd"/>
+      <w:r>
+        <w:rPr>
+          <w:lang w:val="es-CO"/>
+        </w:rPr>
+        <w:t xml:space="preserve"> primero de su propio chiste—. De kilómetros no llevo nada, gracias a Dios. Eso es trabajo de ustedes los jóvenes.</w:t>
       </w:r>
     </w:p>
     <w:p>
@@ -3323,7 +3466,21 @@
         <w:rPr>
           <w:lang w:val="es-CO"/>
         </w:rPr>
-        <w:t>—Yo no veo na', muchacho. En estas carreras mejor no ver. Verlo a uno es carísimo.</w:t>
+        <w:t xml:space="preserve">—Yo no veo </w:t>
+      </w:r>
+      <w:proofErr w:type="spellStart"/>
+      <w:r>
+        <w:rPr>
+          <w:lang w:val="es-CO"/>
+        </w:rPr>
+        <w:t>na</w:t>
+      </w:r>
+      <w:proofErr w:type="spellEnd"/>
+      <w:r>
+        <w:rPr>
+          <w:lang w:val="es-CO"/>
+        </w:rPr>
+        <w:t>', muchacho. En estas carreras mejor no ver. Verlo a uno es carísimo.</w:t>
       </w:r>
     </w:p>
     <w:p>
@@ -3399,7 +3556,21 @@
           <w:lang w:val="es-CO"/>
         </w:rPr>
         <w:lastRenderedPageBreak/>
-        <w:t>—Una sábana blanca tendida en un alambre, con sus pinzas. El viento la levantaba y la soltaba. Le seguí dando gracias igual, porque el ángel me sacó de allá de todos modos. El cansancio pinta, muchacho: pinta lo que uno necesita pa' terminar. Ahora, lo otro, lo que se ve con la nuca y no con los ojos, eso mejor no nombrarlo.</w:t>
+        <w:t xml:space="preserve">—Una sábana blanca tendida en un alambre, con sus pinzas. El viento la levantaba y la soltaba. Le seguí dando gracias igual, porque el ángel me sacó de allá de todos modos. El cansancio pinta, muchacho: pinta lo que uno necesita </w:t>
+      </w:r>
+      <w:proofErr w:type="spellStart"/>
+      <w:r>
+        <w:rPr>
+          <w:lang w:val="es-CO"/>
+        </w:rPr>
+        <w:t>pa</w:t>
+      </w:r>
+      <w:proofErr w:type="spellEnd"/>
+      <w:r>
+        <w:rPr>
+          <w:lang w:val="es-CO"/>
+        </w:rPr>
+        <w:t>' terminar. Ahora, lo otro, lo que se ve con la nuca y no con los ojos, eso mejor no nombrarlo.</w:t>
       </w:r>
     </w:p>
     <w:p>
@@ -3918,7 +4089,21 @@
         <w:rPr>
           <w:lang w:val="es-CO"/>
         </w:rPr>
-        <w:t>—Yo desde aquí. Ahora. —Tragó saliva—. Mírala bien. Decídemelo vos también, porque si no la ves, yo estoy viendo cosas, y eso es otro problema.</w:t>
+        <w:t xml:space="preserve">—Yo desde aquí. Ahora. —Tragó saliva—. Mírala bien. Decídemelo vos también, porque si no la </w:t>
+      </w:r>
+      <w:proofErr w:type="spellStart"/>
+      <w:r>
+        <w:rPr>
+          <w:lang w:val="es-CO"/>
+        </w:rPr>
+        <w:t>ves</w:t>
+      </w:r>
+      <w:proofErr w:type="spellEnd"/>
+      <w:r>
+        <w:rPr>
+          <w:lang w:val="es-CO"/>
+        </w:rPr>
+        <w:t>, yo estoy viendo cosas, y eso es otro problema.</w:t>
       </w:r>
     </w:p>
     <w:p>
@@ -4039,7 +4224,21 @@
         <w:rPr>
           <w:lang w:val="es-CO"/>
         </w:rPr>
-        <w:t>—Runy.</w:t>
+        <w:t>—</w:t>
+      </w:r>
+      <w:proofErr w:type="spellStart"/>
+      <w:r>
+        <w:rPr>
+          <w:lang w:val="es-CO"/>
+        </w:rPr>
+        <w:t>Runy</w:t>
+      </w:r>
+      <w:proofErr w:type="spellEnd"/>
+      <w:r>
+        <w:rPr>
+          <w:lang w:val="es-CO"/>
+        </w:rPr>
+        <w:t>.</w:t>
       </w:r>
     </w:p>
     <w:p>
@@ -4084,7 +4283,35 @@
         <w:rPr>
           <w:lang w:val="es-CO"/>
         </w:rPr>
-        <w:t>—Runy —lo probó de nuevo, saboreándolo—. Vos sos el del dorsal raro. Vi tu número en la salida y pensé: ese señor tiene historia o tiene deuda.</w:t>
+        <w:t>—</w:t>
+      </w:r>
+      <w:proofErr w:type="spellStart"/>
+      <w:r>
+        <w:rPr>
+          <w:lang w:val="es-CO"/>
+        </w:rPr>
+        <w:t>Runy</w:t>
+      </w:r>
+      <w:proofErr w:type="spellEnd"/>
+      <w:r>
+        <w:rPr>
+          <w:lang w:val="es-CO"/>
+        </w:rPr>
+        <w:t xml:space="preserve"> —lo probó de nuevo, saboreándolo—. Vos </w:t>
+      </w:r>
+      <w:proofErr w:type="spellStart"/>
+      <w:r>
+        <w:rPr>
+          <w:lang w:val="es-CO"/>
+        </w:rPr>
+        <w:t>sos</w:t>
+      </w:r>
+      <w:proofErr w:type="spellEnd"/>
+      <w:r>
+        <w:rPr>
+          <w:lang w:val="es-CO"/>
+        </w:rPr>
+        <w:t xml:space="preserve"> el del dorsal raro. Vi tu número en la salida y pensé: ese señor tiene historia o tiene deuda.</w:t>
       </w:r>
     </w:p>
     <w:p>
@@ -4129,7 +4356,21 @@
         <w:rPr>
           <w:lang w:val="es-CO"/>
         </w:rPr>
-        <w:t>—¿Y vos qué hacés? —le pregunté—. Además de correr.</w:t>
+        <w:t xml:space="preserve">—¿Y vos qué </w:t>
+      </w:r>
+      <w:proofErr w:type="spellStart"/>
+      <w:r>
+        <w:rPr>
+          <w:lang w:val="es-CO"/>
+        </w:rPr>
+        <w:t>hacés</w:t>
+      </w:r>
+      <w:proofErr w:type="spellEnd"/>
+      <w:r>
+        <w:rPr>
+          <w:lang w:val="es-CO"/>
+        </w:rPr>
+        <w:t>? —le pregunté—. Además de correr.</w:t>
       </w:r>
     </w:p>
     <w:p>
@@ -4181,7 +4422,21 @@
           <w:lang w:val="es-CO"/>
         </w:rPr>
         <w:lastRenderedPageBreak/>
-        <w:t>huésped cree que quiere subir al árbol, y en realidad es el parásito el que necesita el árbol. Es reconfortante, si lo pensás bien. Alivia la responsabilidad.</w:t>
+        <w:t xml:space="preserve">huésped cree que quiere subir al árbol, y en realidad es el parásito el que necesita el árbol. Es reconfortante, si lo </w:t>
+      </w:r>
+      <w:proofErr w:type="spellStart"/>
+      <w:r>
+        <w:rPr>
+          <w:lang w:val="es-CO"/>
+        </w:rPr>
+        <w:t>pensás</w:t>
+      </w:r>
+      <w:proofErr w:type="spellEnd"/>
+      <w:r>
+        <w:rPr>
+          <w:lang w:val="es-CO"/>
+        </w:rPr>
+        <w:t xml:space="preserve"> bien. Alivia la responsabilidad.</w:t>
       </w:r>
     </w:p>
     <w:p>
@@ -4323,7 +4578,19 @@
           <w:lang w:val="es-CO"/>
         </w:rPr>
         <w:lastRenderedPageBreak/>
-        <w:t>número que mi padre dijo con el último aliento. El que llevaba cosido al pecho. Escrito a lápiz en un papel quemado, encontrado a trescientos kilómetros de mi casa, un año antes de que yo me inscribiera.</w:t>
+        <w:t xml:space="preserve">número que mi padre dijo con el último aliento. El que llevaba </w:t>
+      </w:r>
+      <w:r>
+        <w:rPr>
+          <w:lang w:val="es-CO"/>
+        </w:rPr>
+        <w:t>pegado</w:t>
+      </w:r>
+      <w:r>
+        <w:rPr>
+          <w:lang w:val="es-CO"/>
+        </w:rPr>
+        <w:t xml:space="preserve"> al pecho. Escrito a lápiz en un papel quemado, encontrado a trescientos kilómetros de mi casa, un año antes de que yo me inscribiera.</w:t>
       </w:r>
     </w:p>
     <w:p>
@@ -4474,7 +4741,21 @@
         <w:rPr>
           <w:lang w:val="es-CO"/>
         </w:rPr>
-        <w:t>—Corré —dijo Valentina. No gritó. Y arrancamos.</w:t>
+        <w:t>—</w:t>
+      </w:r>
+      <w:proofErr w:type="spellStart"/>
+      <w:r>
+        <w:rPr>
+          <w:lang w:val="es-CO"/>
+        </w:rPr>
+        <w:t>Corré</w:t>
+      </w:r>
+      <w:proofErr w:type="spellEnd"/>
+      <w:r>
+        <w:rPr>
+          <w:lang w:val="es-CO"/>
+        </w:rPr>
+        <w:t xml:space="preserve"> —dijo Valentina. No gritó. Y arrancamos.</w:t>
       </w:r>
     </w:p>
     <w:p>
@@ -4917,7 +5198,21 @@
         <w:rPr>
           <w:lang w:val="es-CO"/>
         </w:rPr>
-        <w:t>—Runy —la voz de Valentina me alcanzó desde la ruta—. Ven. Caminando. ¿Qué sentiste?</w:t>
+        <w:t>—</w:t>
+      </w:r>
+      <w:proofErr w:type="spellStart"/>
+      <w:r>
+        <w:rPr>
+          <w:lang w:val="es-CO"/>
+        </w:rPr>
+        <w:t>Runy</w:t>
+      </w:r>
+      <w:proofErr w:type="spellEnd"/>
+      <w:r>
+        <w:rPr>
+          <w:lang w:val="es-CO"/>
+        </w:rPr>
+        <w:t xml:space="preserve"> —la voz de Valentina me alcanzó desde la ruta—. Ven. Caminando. ¿Qué sentiste?</w:t>
       </w:r>
     </w:p>
     <w:p>
@@ -4999,7 +5294,21 @@
         <w:rPr>
           <w:lang w:val="es-CO"/>
         </w:rPr>
-        <w:t>—¿Sabés qué es esto? —le pregunté, sin aire para más.</w:t>
+        <w:t>—¿</w:t>
+      </w:r>
+      <w:proofErr w:type="spellStart"/>
+      <w:r>
+        <w:rPr>
+          <w:lang w:val="es-CO"/>
+        </w:rPr>
+        <w:t>Sabés</w:t>
+      </w:r>
+      <w:proofErr w:type="spellEnd"/>
+      <w:r>
+        <w:rPr>
+          <w:lang w:val="es-CO"/>
+        </w:rPr>
+        <w:t xml:space="preserve"> qué es esto? —le pregunté, sin aire para más.</w:t>
       </w:r>
     </w:p>
     <w:p>
@@ -5452,7 +5761,21 @@
         <w:rPr>
           <w:lang w:val="es-CO"/>
         </w:rPr>
-        <w:t>—Entonces entrá.</w:t>
+        <w:t xml:space="preserve">—Entonces </w:t>
+      </w:r>
+      <w:proofErr w:type="spellStart"/>
+      <w:r>
+        <w:rPr>
+          <w:lang w:val="es-CO"/>
+        </w:rPr>
+        <w:t>entrá</w:t>
+      </w:r>
+      <w:proofErr w:type="spellEnd"/>
+      <w:r>
+        <w:rPr>
+          <w:lang w:val="es-CO"/>
+        </w:rPr>
+        <w:t>.</w:t>
       </w:r>
     </w:p>
     <w:p>
@@ -5519,7 +5842,21 @@
         <w:rPr>
           <w:lang w:val="es-CO"/>
         </w:rPr>
-        <w:t>Cuando la imagen se acercó lo suficiente y quise verle la cara, se acabó, porque los filos son así: te muestran hasta donde aguantás.</w:t>
+        <w:t xml:space="preserve">Cuando la imagen se acercó lo suficiente y quise verle la cara, se acabó, porque los filos son así: te muestran hasta donde </w:t>
+      </w:r>
+      <w:proofErr w:type="spellStart"/>
+      <w:r>
+        <w:rPr>
+          <w:lang w:val="es-CO"/>
+        </w:rPr>
+        <w:t>aguantás</w:t>
+      </w:r>
+      <w:proofErr w:type="spellEnd"/>
+      <w:r>
+        <w:rPr>
+          <w:lang w:val="es-CO"/>
+        </w:rPr>
+        <w:t>.</w:t>
       </w:r>
     </w:p>
     <w:p>
@@ -5655,7 +5992,21 @@
         <w:rPr>
           <w:lang w:val="es-CO"/>
         </w:rPr>
-        <w:t>Volvimos a correr. Adelante, el niño ya se ponía en movimiento, y su paso encontró el mío, y fuimos uno detrás del otro hacia el kilómetro siguiente, cargando cada quien su propia versión de los cinco metros.</w:t>
+        <w:t xml:space="preserve">Volvimos a correr. Adelante, el niño ya se ponía en movimiento, y su paso encontró el mío, y fuimos uno detrás del otro hacia el kilómetro siguiente, cargando </w:t>
+      </w:r>
+      <w:proofErr w:type="gramStart"/>
+      <w:r>
+        <w:rPr>
+          <w:lang w:val="es-CO"/>
+        </w:rPr>
+        <w:t>cada quien</w:t>
+      </w:r>
+      <w:proofErr w:type="gramEnd"/>
+      <w:r>
+        <w:rPr>
+          <w:lang w:val="es-CO"/>
+        </w:rPr>
+        <w:t xml:space="preserve"> su propia versión de los cinco metros.</w:t>
       </w:r>
     </w:p>
     <w:p>
@@ -5871,7 +6222,35 @@
         <w:rPr>
           <w:lang w:val="es-CO"/>
         </w:rPr>
-        <w:t>—Es que no hay plaquetas, Runy. Las plaquetas llegan adonde hay herida. Acá no hay herida de verdad. Hay una copia de herida y una copia de respuesta. —Hizo una pausa, y la voz clínica se le dobló un grado—. Qué limpio es.</w:t>
+        <w:t xml:space="preserve">—Es que no hay plaquetas, </w:t>
+      </w:r>
+      <w:proofErr w:type="spellStart"/>
+      <w:r>
+        <w:rPr>
+          <w:lang w:val="es-CO"/>
+        </w:rPr>
+        <w:t>Runy</w:t>
+      </w:r>
+      <w:proofErr w:type="spellEnd"/>
+      <w:r>
+        <w:rPr>
+          <w:lang w:val="es-CO"/>
+        </w:rPr>
+        <w:t xml:space="preserve">. Las plaquetas llegan </w:t>
+      </w:r>
+      <w:proofErr w:type="spellStart"/>
+      <w:r>
+        <w:rPr>
+          <w:lang w:val="es-CO"/>
+        </w:rPr>
+        <w:t>adonde</w:t>
+      </w:r>
+      <w:proofErr w:type="spellEnd"/>
+      <w:r>
+        <w:rPr>
+          <w:lang w:val="es-CO"/>
+        </w:rPr>
+        <w:t xml:space="preserve"> hay herida. Acá no hay herida de verdad. Hay una copia de herida y una copia de respuesta. —Hizo una pausa, y la voz clínica se le dobló un grado—. Qué limpio es.</w:t>
       </w:r>
     </w:p>
     <w:p>
@@ -5977,7 +6356,21 @@
         <w:rPr>
           <w:lang w:val="es-CO"/>
         </w:rPr>
-        <w:t>—¿Vos también tenés miedo? —preguntó.</w:t>
+        <w:t xml:space="preserve">—¿Vos también </w:t>
+      </w:r>
+      <w:proofErr w:type="spellStart"/>
+      <w:r>
+        <w:rPr>
+          <w:lang w:val="es-CO"/>
+        </w:rPr>
+        <w:t>tenés</w:t>
+      </w:r>
+      <w:proofErr w:type="spellEnd"/>
+      <w:r>
+        <w:rPr>
+          <w:lang w:val="es-CO"/>
+        </w:rPr>
+        <w:t xml:space="preserve"> miedo? —preguntó.</w:t>
       </w:r>
     </w:p>
     <w:p>
@@ -6059,7 +6452,21 @@
         <w:rPr>
           <w:lang w:val="es-CO"/>
         </w:rPr>
-        <w:t>—Hay que seguir —dijo—. Vos podés detenerte. Yo no. Todavía no sé muchas cosas, pero eso sí lo sé.</w:t>
+        <w:t xml:space="preserve">—Hay que seguir —dijo—. Vos </w:t>
+      </w:r>
+      <w:proofErr w:type="spellStart"/>
+      <w:r>
+        <w:rPr>
+          <w:lang w:val="es-CO"/>
+        </w:rPr>
+        <w:t>podés</w:t>
+      </w:r>
+      <w:proofErr w:type="spellEnd"/>
+      <w:r>
+        <w:rPr>
+          <w:lang w:val="es-CO"/>
+        </w:rPr>
+        <w:t xml:space="preserve"> detenerte. Yo no. Todavía no sé muchas cosas, pero eso sí lo sé.</w:t>
       </w:r>
     </w:p>
     <w:p>
@@ -6270,7 +6677,21 @@
           <w:lang w:val="es-CO"/>
         </w:rPr>
         <w:lastRenderedPageBreak/>
-        <w:t>Miré al niño. Corría a mi derecha, pie con pie. Pero sus ojos ya no estaban en su horizonte privado: estaban en mí, clavados en mi cara, siguiéndome cada microexpresión con atención de instrumento. Y había algo en esa atención que me heló la nuca: no vigilaban. Dirigían.</w:t>
+        <w:t xml:space="preserve">Miré al niño. Corría a mi derecha, pie con pie. Pero sus ojos ya no estaban en su horizonte privado: estaban en mí, clavados en mi cara, siguiéndome cada </w:t>
+      </w:r>
+      <w:proofErr w:type="spellStart"/>
+      <w:r>
+        <w:rPr>
+          <w:lang w:val="es-CO"/>
+        </w:rPr>
+        <w:t>microexpresión</w:t>
+      </w:r>
+      <w:proofErr w:type="spellEnd"/>
+      <w:r>
+        <w:rPr>
+          <w:lang w:val="es-CO"/>
+        </w:rPr>
+        <w:t xml:space="preserve"> con atención de instrumento. Y había algo en esa atención que me heló la nuca: no vigilaban. Dirigían.</w:t>
       </w:r>
     </w:p>
     <w:p>
@@ -6345,7 +6766,21 @@
         <w:rPr>
           <w:lang w:val="es-CO"/>
         </w:rPr>
-        <w:t>Óptimo. Podemos. Sostenerlo. Tres palabras de manual cayendo sobre la mañana. Traté de aflojar por mi cuenta, mandarle a mis piernas la orden vieja de tranquilo, y las piernas desobedecieron. Mis piernas. Las que yo había pagado con fisioterapia, con hielo, con meses de cinco de la mañana. Desobedecieron como obedecen los empleados a otro jefe.</w:t>
+        <w:t xml:space="preserve">Óptimo. Podemos. Sostenerlo. Tres palabras de manual cayendo sobre la mañana. Traté de aflojar por mi cuenta, </w:t>
+      </w:r>
+      <w:proofErr w:type="gramStart"/>
+      <w:r>
+        <w:rPr>
+          <w:lang w:val="es-CO"/>
+        </w:rPr>
+        <w:t>mandarle</w:t>
+      </w:r>
+      <w:proofErr w:type="gramEnd"/>
+      <w:r>
+        <w:rPr>
+          <w:lang w:val="es-CO"/>
+        </w:rPr>
+        <w:t xml:space="preserve"> a mis piernas la orden vieja de tranquilo, y las piernas desobedecieron. Mis piernas. Las que yo había pagado con fisioterapia, con hielo, con meses de cinco de la mañana. Desobedecieron como obedecen los empleados a otro jefe.</w:t>
       </w:r>
     </w:p>
     <w:p>
@@ -6451,7 +6886,35 @@
         <w:rPr>
           <w:lang w:val="es-CO"/>
         </w:rPr>
-        <w:t>—Runy. Mirame. Respiración cuatro-cuatro. Conmigo. A-dentro. A-fuera.</w:t>
+        <w:t>—</w:t>
+      </w:r>
+      <w:proofErr w:type="spellStart"/>
+      <w:r>
+        <w:rPr>
+          <w:lang w:val="es-CO"/>
+        </w:rPr>
+        <w:t>Runy</w:t>
+      </w:r>
+      <w:proofErr w:type="spellEnd"/>
+      <w:r>
+        <w:rPr>
+          <w:lang w:val="es-CO"/>
+        </w:rPr>
+        <w:t xml:space="preserve">. </w:t>
+      </w:r>
+      <w:proofErr w:type="spellStart"/>
+      <w:r>
+        <w:rPr>
+          <w:lang w:val="es-CO"/>
+        </w:rPr>
+        <w:t>Mirame</w:t>
+      </w:r>
+      <w:proofErr w:type="spellEnd"/>
+      <w:r>
+        <w:rPr>
+          <w:lang w:val="es-CO"/>
+        </w:rPr>
+        <w:t>. Respiración cuatro-cuatro. Conmigo. A-dentro. A-fuera.</w:t>
       </w:r>
     </w:p>
     <w:p>
@@ -6481,7 +6944,35 @@
         <w:rPr>
           <w:lang w:val="es-CO"/>
         </w:rPr>
-        <w:t>—Podés. Yo también tuve un año entero en que el cuerpo hacía cosas sin consultarme. Lloraba en los semáforos. Me despertaba corriendo en la cama. El cuerpo sin dueño hace eso: toma el volante. —Apretó más—. Pero esta casa es tuya. Desalojalo despacio. Con respiración. No con fuerza.</w:t>
+        <w:t>—</w:t>
+      </w:r>
+      <w:proofErr w:type="spellStart"/>
+      <w:r>
+        <w:rPr>
+          <w:lang w:val="es-CO"/>
+        </w:rPr>
+        <w:t>Podés</w:t>
+      </w:r>
+      <w:proofErr w:type="spellEnd"/>
+      <w:r>
+        <w:rPr>
+          <w:lang w:val="es-CO"/>
+        </w:rPr>
+        <w:t xml:space="preserve">. Yo también tuve un año entero en que el cuerpo hacía cosas sin consultarme. Lloraba en los semáforos. Me despertaba corriendo en la cama. El cuerpo sin dueño hace eso: toma el volante. —Apretó más—. Pero esta casa es tuya. </w:t>
+      </w:r>
+      <w:proofErr w:type="spellStart"/>
+      <w:r>
+        <w:rPr>
+          <w:lang w:val="es-CO"/>
+        </w:rPr>
+        <w:t>Desalojalo</w:t>
+      </w:r>
+      <w:proofErr w:type="spellEnd"/>
+      <w:r>
+        <w:rPr>
+          <w:lang w:val="es-CO"/>
+        </w:rPr>
+        <w:t xml:space="preserve"> despacio. Con respiración. No con fuerza.</w:t>
       </w:r>
     </w:p>
     <w:p>
@@ -6511,22 +7002,92 @@
         <w:rPr>
           <w:lang w:val="es-CO"/>
         </w:rPr>
-        <w:t>—Es simple y aburrido, como todo lo que funciona. Inhalás contando cuatro pasos. Exhalás contando otros cuatro. Nada más. Si la cabeza se te va, volvés al cuatro y arrancás de nuevo. —Me llevó el ritmo con la voz, clavando sílabas contra el paso—. Uno, dos, tres, cuatro, adentro. Uno, dos, tres, cuatro, afuera.</w:t>
-      </w:r>
-    </w:p>
-    <w:p>
-      <w:pPr>
-        <w:ind w:firstLine="432"/>
-        <w:jc w:val="both"/>
-        <w:rPr>
-          <w:lang w:val="es-CO"/>
-        </w:rPr>
-      </w:pPr>
-      <w:r>
-        <w:rPr>
-          <w:lang w:val="es-CO"/>
-        </w:rPr>
-        <w:t>Obedecí números como último ciudadano libre de mi propio pecho. Cuatro pasos entrando. Cuatro saliendo. Ella contaba bajito, y su voz tenía el defecto perfecto de no ser digital: se adelantaba en las subidas, se atrasaba en los pozos, y esos errores eran anclas tan buenas como la técnica.</w:t>
+        <w:t xml:space="preserve">—Es simple y aburrido, como todo lo que funciona. </w:t>
+      </w:r>
+      <w:proofErr w:type="spellStart"/>
+      <w:r>
+        <w:rPr>
+          <w:lang w:val="es-CO"/>
+        </w:rPr>
+        <w:t>Inhalás</w:t>
+      </w:r>
+      <w:proofErr w:type="spellEnd"/>
+      <w:r>
+        <w:rPr>
+          <w:lang w:val="es-CO"/>
+        </w:rPr>
+        <w:t xml:space="preserve"> contando cuatro pasos. </w:t>
+      </w:r>
+      <w:proofErr w:type="spellStart"/>
+      <w:r>
+        <w:rPr>
+          <w:lang w:val="es-CO"/>
+        </w:rPr>
+        <w:t>Exhalás</w:t>
+      </w:r>
+      <w:proofErr w:type="spellEnd"/>
+      <w:r>
+        <w:rPr>
+          <w:lang w:val="es-CO"/>
+        </w:rPr>
+        <w:t xml:space="preserve"> contando otros cuatro. Nada más. Si la cabeza se te va, </w:t>
+      </w:r>
+      <w:proofErr w:type="spellStart"/>
+      <w:r>
+        <w:rPr>
+          <w:lang w:val="es-CO"/>
+        </w:rPr>
+        <w:t>volvés</w:t>
+      </w:r>
+      <w:proofErr w:type="spellEnd"/>
+      <w:r>
+        <w:rPr>
+          <w:lang w:val="es-CO"/>
+        </w:rPr>
+        <w:t xml:space="preserve"> al cuatro y </w:t>
+      </w:r>
+      <w:proofErr w:type="spellStart"/>
+      <w:r>
+        <w:rPr>
+          <w:lang w:val="es-CO"/>
+        </w:rPr>
+        <w:t>arrancás</w:t>
+      </w:r>
+      <w:proofErr w:type="spellEnd"/>
+      <w:r>
+        <w:rPr>
+          <w:lang w:val="es-CO"/>
+        </w:rPr>
+        <w:t xml:space="preserve"> de nuevo. —Me llevó el ritmo con la voz, clavando sílabas contra el paso—. Uno, dos, tres, cuatro, adentro. Uno, dos, tres, cuatro, afuera.</w:t>
+      </w:r>
+    </w:p>
+    <w:p>
+      <w:pPr>
+        <w:ind w:firstLine="432"/>
+        <w:jc w:val="both"/>
+        <w:rPr>
+          <w:lang w:val="es-CO"/>
+        </w:rPr>
+      </w:pPr>
+      <w:r>
+        <w:rPr>
+          <w:lang w:val="es-CO"/>
+        </w:rPr>
+        <w:t xml:space="preserve">Obedecí números como último ciudadano libre de mi propio pecho. Cuatro pasos entrando. Cuatro saliendo. Ella contaba </w:t>
+      </w:r>
+      <w:proofErr w:type="gramStart"/>
+      <w:r>
+        <w:rPr>
+          <w:lang w:val="es-CO"/>
+        </w:rPr>
+        <w:t>bajito</w:t>
+      </w:r>
+      <w:proofErr w:type="gramEnd"/>
+      <w:r>
+        <w:rPr>
+          <w:lang w:val="es-CO"/>
+        </w:rPr>
+        <w:t>, y su voz tenía el defecto perfecto de no ser digital: se adelantaba en las subidas, se atrasaba en los pozos, y esos errores eran anclas tan buenas como la técnica.</w:t>
       </w:r>
     </w:p>
     <w:p>
@@ -6757,7 +7318,21 @@
         <w:rPr>
           <w:lang w:val="es-CO"/>
         </w:rPr>
-        <w:t>—No podés detenerte —dijo.</w:t>
+        <w:t xml:space="preserve">—No </w:t>
+      </w:r>
+      <w:proofErr w:type="spellStart"/>
+      <w:r>
+        <w:rPr>
+          <w:lang w:val="es-CO"/>
+        </w:rPr>
+        <w:t>podés</w:t>
+      </w:r>
+      <w:proofErr w:type="spellEnd"/>
+      <w:r>
+        <w:rPr>
+          <w:lang w:val="es-CO"/>
+        </w:rPr>
+        <w:t xml:space="preserve"> detenerte —dijo.</w:t>
       </w:r>
     </w:p>
     <w:p>
@@ -6833,22 +7408,50 @@
         <w:rPr>
           <w:lang w:val="es-CO"/>
         </w:rPr>
-        <w:t>—Entonces tengo un conflicto —dijo al fin, con una honestidad que dolía—. La instrucción dice: correr con vos. Si vos no corrés, yo tampoco corro.</w:t>
-      </w:r>
-    </w:p>
-    <w:p>
-      <w:pPr>
-        <w:ind w:firstLine="432"/>
-        <w:jc w:val="both"/>
-        <w:rPr>
-          <w:lang w:val="es-CO"/>
-        </w:rPr>
-      </w:pPr>
-      <w:r>
-        <w:rPr>
-          <w:lang w:val="es-CO"/>
-        </w:rPr>
-        <w:t>—Ahora sabés una cosa nueva —dije—. Bienvenido.</w:t>
+        <w:t xml:space="preserve">—Entonces tengo un conflicto —dijo al fin, con una honestidad que dolía—. La instrucción dice: correr con vos. Si vos no </w:t>
+      </w:r>
+      <w:proofErr w:type="spellStart"/>
+      <w:r>
+        <w:rPr>
+          <w:lang w:val="es-CO"/>
+        </w:rPr>
+        <w:t>corrés</w:t>
+      </w:r>
+      <w:proofErr w:type="spellEnd"/>
+      <w:r>
+        <w:rPr>
+          <w:lang w:val="es-CO"/>
+        </w:rPr>
+        <w:t>, yo tampoco corro.</w:t>
+      </w:r>
+    </w:p>
+    <w:p>
+      <w:pPr>
+        <w:ind w:firstLine="432"/>
+        <w:jc w:val="both"/>
+        <w:rPr>
+          <w:lang w:val="es-CO"/>
+        </w:rPr>
+      </w:pPr>
+      <w:r>
+        <w:rPr>
+          <w:lang w:val="es-CO"/>
+        </w:rPr>
+        <w:t xml:space="preserve">—Ahora </w:t>
+      </w:r>
+      <w:proofErr w:type="spellStart"/>
+      <w:r>
+        <w:rPr>
+          <w:lang w:val="es-CO"/>
+        </w:rPr>
+        <w:t>sabés</w:t>
+      </w:r>
+      <w:proofErr w:type="spellEnd"/>
+      <w:r>
+        <w:rPr>
+          <w:lang w:val="es-CO"/>
+        </w:rPr>
+        <w:t xml:space="preserve"> una cosa nueva —dije—. Bienvenido.</w:t>
       </w:r>
     </w:p>
     <w:p>
@@ -7133,7 +7736,35 @@
         <w:rPr>
           <w:lang w:val="es-CO"/>
         </w:rPr>
-        <w:t>—¿Pa' llevar o pa' acá?</w:t>
+        <w:t>—¿</w:t>
+      </w:r>
+      <w:proofErr w:type="spellStart"/>
+      <w:r>
+        <w:rPr>
+          <w:lang w:val="es-CO"/>
+        </w:rPr>
+        <w:t>Pa</w:t>
+      </w:r>
+      <w:proofErr w:type="spellEnd"/>
+      <w:r>
+        <w:rPr>
+          <w:lang w:val="es-CO"/>
+        </w:rPr>
+        <w:t xml:space="preserve">' llevar o </w:t>
+      </w:r>
+      <w:proofErr w:type="spellStart"/>
+      <w:r>
+        <w:rPr>
+          <w:lang w:val="es-CO"/>
+        </w:rPr>
+        <w:t>pa</w:t>
+      </w:r>
+      <w:proofErr w:type="spellEnd"/>
+      <w:r>
+        <w:rPr>
+          <w:lang w:val="es-CO"/>
+        </w:rPr>
+        <w:t>' acá?</w:t>
       </w:r>
     </w:p>
     <w:p>
@@ -7151,12 +7782,21 @@
         <w:lastRenderedPageBreak/>
         <w:t xml:space="preserve">Me quedé mirándola un segundo. Nadie viene </w:t>
       </w:r>
+      <w:proofErr w:type="spellStart"/>
       <w:r>
         <w:rPr>
           <w:i/>
           <w:lang w:val="es-CO"/>
         </w:rPr>
-        <w:t>pa' acá</w:t>
+        <w:t>pa</w:t>
+      </w:r>
+      <w:proofErr w:type="spellEnd"/>
+      <w:r>
+        <w:rPr>
+          <w:i/>
+          <w:lang w:val="es-CO"/>
+        </w:rPr>
+        <w:t>' acá</w:t>
       </w:r>
       <w:r>
         <w:rPr>
@@ -7177,7 +7817,21 @@
         <w:rPr>
           <w:lang w:val="es-CO"/>
         </w:rPr>
-        <w:t>—Pa' acá.</w:t>
+        <w:t>—</w:t>
+      </w:r>
+      <w:proofErr w:type="spellStart"/>
+      <w:r>
+        <w:rPr>
+          <w:lang w:val="es-CO"/>
+        </w:rPr>
+        <w:t>Pa</w:t>
+      </w:r>
+      <w:proofErr w:type="spellEnd"/>
+      <w:r>
+        <w:rPr>
+          <w:lang w:val="es-CO"/>
+        </w:rPr>
+        <w:t>' acá.</w:t>
       </w:r>
     </w:p>
     <w:p>
@@ -7312,7 +7966,21 @@
         <w:rPr>
           <w:lang w:val="es-CO"/>
         </w:rPr>
-        <w:t>—Sentate —dije. Suave. Sin orden en la voz. Como se le dicen las cosas a un niño de verdad.</w:t>
+        <w:t>—</w:t>
+      </w:r>
+      <w:proofErr w:type="spellStart"/>
+      <w:r>
+        <w:rPr>
+          <w:lang w:val="es-CO"/>
+        </w:rPr>
+        <w:t>Sentate</w:t>
+      </w:r>
+      <w:proofErr w:type="spellEnd"/>
+      <w:r>
+        <w:rPr>
+          <w:lang w:val="es-CO"/>
+        </w:rPr>
+        <w:t xml:space="preserve"> —dije. Suave. Sin orden en la voz. Como se le dicen las cosas a un niño de verdad.</w:t>
       </w:r>
     </w:p>
     <w:p>
@@ -7961,7 +8629,21 @@
         <w:rPr>
           <w:lang w:val="es-CO"/>
         </w:rPr>
-        <w:t>—¿Sabés qué dice acá? —le pregunté, tocándole la etiqueta.</w:t>
+        <w:t>—¿</w:t>
+      </w:r>
+      <w:proofErr w:type="spellStart"/>
+      <w:r>
+        <w:rPr>
+          <w:lang w:val="es-CO"/>
+        </w:rPr>
+        <w:t>Sabés</w:t>
+      </w:r>
+      <w:proofErr w:type="spellEnd"/>
+      <w:r>
+        <w:rPr>
+          <w:lang w:val="es-CO"/>
+        </w:rPr>
+        <w:t xml:space="preserve"> qué dice acá? —le pregunté, tocándole la etiqueta.</w:t>
       </w:r>
     </w:p>
     <w:p>
@@ -8051,7 +8733,21 @@
         <w:rPr>
           <w:lang w:val="es-CO"/>
         </w:rPr>
-        <w:t xml:space="preserve">—Lesión de tendón, maratón completada —dijo el niño, con voz de dictamen—. Injuria, no ruptura. Corrible con gestión </w:t>
+        <w:t xml:space="preserve">—Lesión de tendón, maratón completada —dijo el niño, con voz de dictamen—. Injuria, no ruptura. </w:t>
+      </w:r>
+      <w:proofErr w:type="spellStart"/>
+      <w:r>
+        <w:rPr>
+          <w:lang w:val="es-CO"/>
+        </w:rPr>
+        <w:t>Corrible</w:t>
+      </w:r>
+      <w:proofErr w:type="spellEnd"/>
+      <w:r>
+        <w:rPr>
+          <w:lang w:val="es-CO"/>
+        </w:rPr>
+        <w:t xml:space="preserve"> con gestión </w:t>
       </w:r>
       <w:r>
         <w:rPr>
@@ -8192,7 +8888,21 @@
         <w:rPr>
           <w:lang w:val="es-CO"/>
         </w:rPr>
-        <w:t>—Ella bien. Yo mal. Eso es buen síntoma, mija: cuando duele el dueño es que la máquina está funcionando.</w:t>
+        <w:t xml:space="preserve">—Ella bien. Yo mal. Eso es buen síntoma, </w:t>
+      </w:r>
+      <w:proofErr w:type="spellStart"/>
+      <w:r>
+        <w:rPr>
+          <w:lang w:val="es-CO"/>
+        </w:rPr>
+        <w:t>mija</w:t>
+      </w:r>
+      <w:proofErr w:type="spellEnd"/>
+      <w:r>
+        <w:rPr>
+          <w:lang w:val="es-CO"/>
+        </w:rPr>
+        <w:t>: cuando duele el dueño es que la máquina está funcionando.</w:t>
       </w:r>
     </w:p>
     <w:p>
@@ -8358,29 +9068,121 @@
         <w:rPr>
           <w:lang w:val="es-CO"/>
         </w:rPr>
-        <w:t>—Yo corrí Buenos Aires en el noventa y cuatro. Mi decimoquinta. Iba volando, en mi mejor año, entrenando como profesional pobre, que es como uno entrena cuando tiene sueños grandes y poca plata. —Respiró hondo—. En ese año uno llamaba desde teléfonos de moneda, mijo. Me alojaba en un apartamento con el precio escrito en cartón, ventilador de techo girando despacio, y en la ventana del frente una señora tenía tendida una bandera argentina que amanecía lavada y llena de sol. Todas las noches hacía fila con las monedas contadas pa' llamar a Barranquilla por cobrar, y mi papá decía «bueno», y ese «bueno» me alcanzaba pa' toda la semana.</w:t>
-      </w:r>
-    </w:p>
-    <w:p>
-      <w:pPr>
-        <w:ind w:firstLine="432"/>
-        <w:jc w:val="both"/>
-        <w:rPr>
-          <w:lang w:val="es-CO"/>
-        </w:rPr>
-      </w:pPr>
-      <w:r>
-        <w:rPr>
-          <w:lang w:val="es-CO"/>
-        </w:rPr>
-        <w:t xml:space="preserve">Por el kilómetro ocho oí un altavoz que decía mi nombre mal pronunciado: «Corredor Tapías, con zeta, favor acercarse a la carpa de información». Yo dije: será otro Tapías. Uno siempre cree que los avisos son pa' otros. E hice lo que hacen los hombres listos de treinta y cuatro años: seguí corriendo. Terminé la carrera. Hice mi mejor marca. Bajé veinte minutos, </w:t>
-      </w:r>
+        <w:t xml:space="preserve">—Yo corrí Buenos Aires en el noventa y cuatro. Mi decimoquinta. Iba volando, en mi mejor año, entrenando como profesional pobre, que es como uno entrena cuando tiene sueños grandes y poca plata. —Respiró hondo—. En ese año uno llamaba desde teléfonos de moneda, mijo. Me alojaba en un apartamento con el precio escrito en cartón, ventilador de techo girando despacio, y en la ventana del frente una señora tenía tendida una bandera argentina que amanecía lavada y llena de sol. Todas las noches hacía fila con las monedas contadas </w:t>
+      </w:r>
+      <w:proofErr w:type="spellStart"/>
+      <w:r>
+        <w:rPr>
+          <w:lang w:val="es-CO"/>
+        </w:rPr>
+        <w:t>pa</w:t>
+      </w:r>
+      <w:proofErr w:type="spellEnd"/>
+      <w:r>
+        <w:rPr>
+          <w:lang w:val="es-CO"/>
+        </w:rPr>
+        <w:t xml:space="preserve">' llamar a Barranquilla por cobrar, y mi papá decía «bueno», y ese «bueno» me alcanzaba </w:t>
+      </w:r>
+      <w:proofErr w:type="spellStart"/>
+      <w:r>
+        <w:rPr>
+          <w:lang w:val="es-CO"/>
+        </w:rPr>
+        <w:t>pa</w:t>
+      </w:r>
+      <w:proofErr w:type="spellEnd"/>
+      <w:r>
+        <w:rPr>
+          <w:lang w:val="es-CO"/>
+        </w:rPr>
+        <w:t>' toda la semana.</w:t>
+      </w:r>
+    </w:p>
+    <w:p>
+      <w:pPr>
+        <w:ind w:firstLine="432"/>
+        <w:jc w:val="both"/>
+        <w:rPr>
+          <w:lang w:val="es-CO"/>
+        </w:rPr>
+      </w:pPr>
+      <w:r>
+        <w:rPr>
+          <w:lang w:val="es-CO"/>
+        </w:rPr>
+        <w:t xml:space="preserve">Por el kilómetro ocho oí un altavoz que decía mi nombre mal pronunciado: «Corredor </w:t>
+      </w:r>
+      <w:proofErr w:type="spellStart"/>
+      <w:r>
+        <w:rPr>
+          <w:lang w:val="es-CO"/>
+        </w:rPr>
+        <w:t>Tapías</w:t>
+      </w:r>
+      <w:proofErr w:type="spellEnd"/>
+      <w:r>
+        <w:rPr>
+          <w:lang w:val="es-CO"/>
+        </w:rPr>
+        <w:t xml:space="preserve">, con zeta, favor acercarse a la carpa de información». Yo dije: será otro </w:t>
+      </w:r>
+      <w:proofErr w:type="spellStart"/>
+      <w:r>
+        <w:rPr>
+          <w:lang w:val="es-CO"/>
+        </w:rPr>
+        <w:t>Tapías</w:t>
+      </w:r>
+      <w:proofErr w:type="spellEnd"/>
+      <w:r>
+        <w:rPr>
+          <w:lang w:val="es-CO"/>
+        </w:rPr>
+        <w:t xml:space="preserve">. Uno siempre cree que los avisos son </w:t>
+      </w:r>
+      <w:proofErr w:type="spellStart"/>
+      <w:r>
+        <w:rPr>
+          <w:lang w:val="es-CO"/>
+        </w:rPr>
+        <w:t>pa</w:t>
+      </w:r>
+      <w:proofErr w:type="spellEnd"/>
+      <w:r>
+        <w:rPr>
+          <w:lang w:val="es-CO"/>
+        </w:rPr>
+        <w:t xml:space="preserve">' otros. E hice lo que hacen los hombres listos de treinta y cuatro años: seguí corriendo. Terminé la carrera. Hice mi mejor marca. Bajé veinte minutos, </w:t>
+      </w:r>
+      <w:proofErr w:type="spellStart"/>
       <w:r>
         <w:rPr>
           <w:lang w:val="es-CO"/>
         </w:rPr>
         <w:lastRenderedPageBreak/>
-        <w:t>mija, veinte minutos, y me dieron una medalla de tercero en mi categoría. Y crucé ese arco con los brazos en alto. Sentí felicidad limpia, de camisa estrenada. Me tomaron una foto que existe todavía en algún álbum ajeno: ahí estoy yo, radiante, prueba de que a un hombre se le puede partir la vida adentro mientras sonríe pa' la foto oficial.</w:t>
+        <w:t>mija</w:t>
+      </w:r>
+      <w:proofErr w:type="spellEnd"/>
+      <w:r>
+        <w:rPr>
+          <w:lang w:val="es-CO"/>
+        </w:rPr>
+        <w:t xml:space="preserve">, veinte minutos, y me dieron una medalla de tercero en mi categoría. Y crucé ese arco con los brazos en alto. Sentí felicidad limpia, de camisa estrenada. Me tomaron una foto que existe todavía en algún álbum ajeno: ahí estoy yo, radiante, prueba de que a un hombre se le puede partir la vida adentro mientras sonríe </w:t>
+      </w:r>
+      <w:proofErr w:type="spellStart"/>
+      <w:r>
+        <w:rPr>
+          <w:lang w:val="es-CO"/>
+        </w:rPr>
+        <w:t>pa</w:t>
+      </w:r>
+      <w:proofErr w:type="spellEnd"/>
+      <w:r>
+        <w:rPr>
+          <w:lang w:val="es-CO"/>
+        </w:rPr>
+        <w:t>' la foto oficial.</w:t>
       </w:r>
     </w:p>
     <w:p>
@@ -8410,7 +9212,21 @@
         <w:rPr>
           <w:lang w:val="es-CO"/>
         </w:rPr>
-        <w:t>—Cuando bajé de la tarima había una llamada perdida. De la casa de doña Mercedes, la vecina de enfrente, la única de mi cuadra con línea telefónica, porque mi papá nunca quiso teléfono propio; decía que era pa' que la gente lo anduviera buscando. Devolví la llamada desde un teléfono de moneda, y timbró y timbró y nadie contestó: estaban todos en la funeraria. Mi papá se murió mientras yo hacía mi mejor marca en la vida. Nunca supe si alcanzó a hablar; doña Mercedes se murió hace años y nunca tuve estómago de preguntar. Qué tristeza.</w:t>
+        <w:t xml:space="preserve">—Cuando bajé de la tarima había una llamada perdida. De la casa de doña Mercedes, la vecina de enfrente, la única de mi cuadra con línea telefónica, porque mi papá nunca quiso teléfono propio; decía que era </w:t>
+      </w:r>
+      <w:proofErr w:type="spellStart"/>
+      <w:r>
+        <w:rPr>
+          <w:lang w:val="es-CO"/>
+        </w:rPr>
+        <w:t>pa</w:t>
+      </w:r>
+      <w:proofErr w:type="spellEnd"/>
+      <w:r>
+        <w:rPr>
+          <w:lang w:val="es-CO"/>
+        </w:rPr>
+        <w:t>' que la gente lo anduviera buscando. Devolví la llamada desde un teléfono de moneda, y timbró y timbró y nadie contestó: estaban todos en la funeraria. Mi papá se murió mientras yo hacía mi mejor marca en la vida. Nunca supe si alcanzó a hablar; doña Mercedes se murió hace años y nunca tuve estómago de preguntar. Qué tristeza.</w:t>
       </w:r>
     </w:p>
     <w:p>
@@ -8440,7 +9256,63 @@
         <w:rPr>
           <w:lang w:val="es-CO"/>
         </w:rPr>
-        <w:t>—Por eso le dije lo de la salida, mijo. Uno no corre pa' llegar. Uno corre pa' dejar de huir. Yo corrí quince años huyendo de un teléfono. Usted corre detrás de un número. Esta muchachita corre detrás de quién sabe qué. Y el pelaito... —lo miró, y por un segundo pareció verlo completo, entero, y no parpadeó—: el pelaito corre porque se lo dejaron escrito.</w:t>
+        <w:t xml:space="preserve">—Por eso le dije lo de la salida, mijo. Uno no corre </w:t>
+      </w:r>
+      <w:proofErr w:type="spellStart"/>
+      <w:r>
+        <w:rPr>
+          <w:lang w:val="es-CO"/>
+        </w:rPr>
+        <w:t>pa</w:t>
+      </w:r>
+      <w:proofErr w:type="spellEnd"/>
+      <w:r>
+        <w:rPr>
+          <w:lang w:val="es-CO"/>
+        </w:rPr>
+        <w:t xml:space="preserve">' llegar. Uno corre </w:t>
+      </w:r>
+      <w:proofErr w:type="spellStart"/>
+      <w:r>
+        <w:rPr>
+          <w:lang w:val="es-CO"/>
+        </w:rPr>
+        <w:t>pa</w:t>
+      </w:r>
+      <w:proofErr w:type="spellEnd"/>
+      <w:r>
+        <w:rPr>
+          <w:lang w:val="es-CO"/>
+        </w:rPr>
+        <w:t xml:space="preserve">' dejar de huir. Yo corrí quince años huyendo de un teléfono. Usted corre detrás de un número. Esta muchachita corre detrás de quién sabe qué. Y el </w:t>
+      </w:r>
+      <w:proofErr w:type="spellStart"/>
+      <w:r>
+        <w:rPr>
+          <w:lang w:val="es-CO"/>
+        </w:rPr>
+        <w:t>pelaito</w:t>
+      </w:r>
+      <w:proofErr w:type="spellEnd"/>
+      <w:r>
+        <w:rPr>
+          <w:lang w:val="es-CO"/>
+        </w:rPr>
+        <w:t xml:space="preserve">... —lo miró, y por un segundo pareció verlo completo, entero, y no parpadeó—: el </w:t>
+      </w:r>
+      <w:proofErr w:type="spellStart"/>
+      <w:r>
+        <w:rPr>
+          <w:lang w:val="es-CO"/>
+        </w:rPr>
+        <w:t>pelaito</w:t>
+      </w:r>
+      <w:proofErr w:type="spellEnd"/>
+      <w:r>
+        <w:rPr>
+          <w:lang w:val="es-CO"/>
+        </w:rPr>
+        <w:t xml:space="preserve"> corre porque se lo dejaron escrito.</w:t>
       </w:r>
     </w:p>
     <w:p>
@@ -8471,7 +9343,21 @@
           <w:lang w:val="es-CO"/>
         </w:rPr>
         <w:lastRenderedPageBreak/>
-        <w:t>—Pero eso ya es cuento de otro nivel —dijo, soltando la risa, cerrando la puerta que él mismo había abierto—. Yo para eso estoy muy viejo y muy bautizado. A mí avísenme cuando toca hidratarse.</w:t>
+        <w:t xml:space="preserve">—Pero eso ya es cuento de otro nivel —dijo, soltando la risa, cerrando la puerta que él mismo había abierto—. Yo para eso estoy </w:t>
+      </w:r>
+      <w:proofErr w:type="gramStart"/>
+      <w:r>
+        <w:rPr>
+          <w:lang w:val="es-CO"/>
+        </w:rPr>
+        <w:t>muy viejo y muy bautizado</w:t>
+      </w:r>
+      <w:proofErr w:type="gramEnd"/>
+      <w:r>
+        <w:rPr>
+          <w:lang w:val="es-CO"/>
+        </w:rPr>
+        <w:t>. A mí avísenme cuando toca hidratarse.</w:t>
       </w:r>
     </w:p>
     <w:p>
@@ -8727,22 +9613,50 @@
         <w:rPr>
           <w:lang w:val="es-CO"/>
         </w:rPr>
-        <w:t>No sé cuánto duré. Poco, según Valentina, que llegó corriendo gritándome cosas que no entendí. Mucho, según mi cuerpo, que tuvo tiempo de visitar varios lugares: la cocina de las cuatro de la mañana, el pasillo verde del hospital, una cancha de barrio al atardecer donde mi padre, veintidós años, más joven de lo que soy yo ahora, llevaba el balón pegado al pie izquierdo mientras el barrio le gritaba un apellido que nadie sabía de dónde salió.</w:t>
-      </w:r>
-    </w:p>
-    <w:p>
-      <w:pPr>
-        <w:ind w:firstLine="432"/>
-        <w:jc w:val="both"/>
-        <w:rPr>
-          <w:lang w:val="es-CO"/>
-        </w:rPr>
-      </w:pPr>
-      <w:r>
-        <w:rPr>
-          <w:lang w:val="es-CO"/>
-        </w:rPr>
-        <w:t>—No se duerma —decía la voz de Valentina—. Runy. Ojos abiertos. Respiración chica, chiquita, como besitos de aire.</w:t>
+        <w:t xml:space="preserve">No sé cuánto duré. Poco, según Valentina, que llegó </w:t>
+      </w:r>
+      <w:proofErr w:type="gramStart"/>
+      <w:r>
+        <w:rPr>
+          <w:lang w:val="es-CO"/>
+        </w:rPr>
+        <w:t>corriendo gritándome</w:t>
+      </w:r>
+      <w:proofErr w:type="gramEnd"/>
+      <w:r>
+        <w:rPr>
+          <w:lang w:val="es-CO"/>
+        </w:rPr>
+        <w:t xml:space="preserve"> cosas que no entendí. Mucho, según mi cuerpo, que tuvo tiempo de visitar varios lugares: la cocina de las cuatro de la mañana, el pasillo verde del hospital, una cancha de barrio al atardecer donde mi padre, veintidós años, más joven de lo que soy yo ahora, llevaba el balón pegado al pie izquierdo mientras el barrio le gritaba un apellido que nadie sabía de dónde salió.</w:t>
+      </w:r>
+    </w:p>
+    <w:p>
+      <w:pPr>
+        <w:ind w:firstLine="432"/>
+        <w:jc w:val="both"/>
+        <w:rPr>
+          <w:lang w:val="es-CO"/>
+        </w:rPr>
+      </w:pPr>
+      <w:r>
+        <w:rPr>
+          <w:lang w:val="es-CO"/>
+        </w:rPr>
+        <w:t xml:space="preserve">—No se duerma —decía la voz de Valentina—. </w:t>
+      </w:r>
+      <w:proofErr w:type="spellStart"/>
+      <w:r>
+        <w:rPr>
+          <w:lang w:val="es-CO"/>
+        </w:rPr>
+        <w:t>Runy</w:t>
+      </w:r>
+      <w:proofErr w:type="spellEnd"/>
+      <w:r>
+        <w:rPr>
+          <w:lang w:val="es-CO"/>
+        </w:rPr>
+        <w:t>. Ojos abiertos. Respiración chica, chiquita, como besitos de aire.</w:t>
       </w:r>
     </w:p>
     <w:p>
@@ -9007,7 +9921,23 @@
           <w:i/>
           <w:lang w:val="es-CO"/>
         </w:rPr>
-        <w:t>Entonces será algo que todavía no necesitás entender.</w:t>
+        <w:t xml:space="preserve">Entonces será algo que todavía no </w:t>
+      </w:r>
+      <w:proofErr w:type="spellStart"/>
+      <w:r>
+        <w:rPr>
+          <w:i/>
+          <w:lang w:val="es-CO"/>
+        </w:rPr>
+        <w:t>necesitás</w:t>
+      </w:r>
+      <w:proofErr w:type="spellEnd"/>
+      <w:r>
+        <w:rPr>
+          <w:i/>
+          <w:lang w:val="es-CO"/>
+        </w:rPr>
+        <w:t xml:space="preserve"> entender.</w:t>
       </w:r>
       <w:r>
         <w:rPr>
@@ -9433,7 +10363,21 @@
           <w:lang w:val="es-CO"/>
         </w:rPr>
         <w:lastRenderedPageBreak/>
-        <w:t>—Entonces se cambia el paso, pelaito —dijo Valentina, sin girarse—. Nunca la meta.</w:t>
+        <w:t xml:space="preserve">—Entonces se cambia el paso, </w:t>
+      </w:r>
+      <w:proofErr w:type="spellStart"/>
+      <w:r>
+        <w:rPr>
+          <w:lang w:val="es-CO"/>
+        </w:rPr>
+        <w:t>pelaito</w:t>
+      </w:r>
+      <w:proofErr w:type="spellEnd"/>
+      <w:r>
+        <w:rPr>
+          <w:lang w:val="es-CO"/>
+        </w:rPr>
+        <w:t xml:space="preserve"> —dijo Valentina, sin girarse—. Nunca la meta.</w:t>
       </w:r>
     </w:p>
     <w:p>
@@ -9523,7 +10467,35 @@
         <w:rPr>
           <w:lang w:val="es-CO"/>
         </w:rPr>
-        <w:t>—En mi oficio decimos que todo organismo vivo intercambia con el entorno. Toma cosas, deja cosas, se transforma en el intercambio. Si no intercambia, está muerto. Por lo que contás, pelaito, estás más vivo que varios de mis jefes.</w:t>
+        <w:t xml:space="preserve">—En mi oficio decimos que todo organismo vivo intercambia con el entorno. Toma cosas, deja cosas, se transforma en el intercambio. Si no intercambia, está muerto. Por lo que </w:t>
+      </w:r>
+      <w:proofErr w:type="spellStart"/>
+      <w:r>
+        <w:rPr>
+          <w:lang w:val="es-CO"/>
+        </w:rPr>
+        <w:t>contás</w:t>
+      </w:r>
+      <w:proofErr w:type="spellEnd"/>
+      <w:r>
+        <w:rPr>
+          <w:lang w:val="es-CO"/>
+        </w:rPr>
+        <w:t xml:space="preserve">, </w:t>
+      </w:r>
+      <w:proofErr w:type="spellStart"/>
+      <w:r>
+        <w:rPr>
+          <w:lang w:val="es-CO"/>
+        </w:rPr>
+        <w:t>pelaito</w:t>
+      </w:r>
+      <w:proofErr w:type="spellEnd"/>
+      <w:r>
+        <w:rPr>
+          <w:lang w:val="es-CO"/>
+        </w:rPr>
+        <w:t>, estás más vivo que varios de mis jefes.</w:t>
       </w:r>
     </w:p>
     <w:p>
@@ -9568,7 +10540,21 @@
         <w:rPr>
           <w:lang w:val="es-CO"/>
         </w:rPr>
-        <w:t>Valentina rió de verdad, sorprendida, una risa que se le escapó antes del permiso. Yo también, y reírme dolió en los abdominales como un ejercicio nuevo. El niño sonrió su sonrisa de estreno, la torcida, contento de haber producido el efecto documentado.</w:t>
+        <w:t xml:space="preserve">Valentina </w:t>
+      </w:r>
+      <w:proofErr w:type="spellStart"/>
+      <w:r>
+        <w:rPr>
+          <w:lang w:val="es-CO"/>
+        </w:rPr>
+        <w:t>rió</w:t>
+      </w:r>
+      <w:proofErr w:type="spellEnd"/>
+      <w:r>
+        <w:rPr>
+          <w:lang w:val="es-CO"/>
+        </w:rPr>
+        <w:t xml:space="preserve"> de verdad, sorprendida, una risa que se le escapó antes del permiso. Yo también, y reírme dolió en los abdominales como un ejercicio nuevo. El niño sonrió su sonrisa de estreno, la torcida, contento de haber producido el efecto documentado.</w:t>
       </w:r>
     </w:p>
     <w:p>
@@ -9721,7 +10707,21 @@
         <w:rPr>
           <w:lang w:val="es-CO"/>
         </w:rPr>
-        <w:t>Se quedó agarrada unos segundos más, la frente casi tocando el metal. Y vi lo único que su cuerpo dejaba ver desde atrás: la mano izquierda, apretada en puño alrededor de la muñeca del mismo lado. El puño cerrado sobre la pulsera de cuero rota, apretando como se aprieta una cuerda al borde del agua. Y en la pierna derecha, justo donde el metal había encontrado el muslo, la tela de la pantaloneta empezaba a contar lo demás: primero nada, un calor que no se veía; después una sombra color ciruela, difusa, creciendo hacia afuera con paciencia de tinta caída en agua. Los golpes grandes hacen eso: el morado llega tarde y se instala como quien no quiere nada.</w:t>
+        <w:t xml:space="preserve">Se quedó agarrada unos segundos más, la frente casi tocando el metal. Y vi lo único que su cuerpo dejaba ver desde atrás: la mano izquierda, apretada en puño alrededor de la muñeca del mismo lado. El </w:t>
+      </w:r>
+      <w:proofErr w:type="gramStart"/>
+      <w:r>
+        <w:rPr>
+          <w:lang w:val="es-CO"/>
+        </w:rPr>
+        <w:t>puño cerrado</w:t>
+      </w:r>
+      <w:proofErr w:type="gramEnd"/>
+      <w:r>
+        <w:rPr>
+          <w:lang w:val="es-CO"/>
+        </w:rPr>
+        <w:t xml:space="preserve"> sobre la pulsera de cuero rota, apretando como se aprieta una cuerda al borde del agua. Y en la pierna derecha, justo donde el metal había encontrado el muslo, la tela de la pantaloneta empezaba a contar lo demás: primero nada, un calor que no se veía; después una sombra color ciruela, difusa, creciendo hacia afuera con paciencia de tinta caída en agua. Los golpes grandes hacen eso: el morado llega tarde y se instala como quien no quiere nada.</w:t>
       </w:r>
     </w:p>
     <w:p>
@@ -9818,7 +10818,21 @@
         <w:rPr>
           <w:lang w:val="es-CO"/>
         </w:rPr>
-        <w:t>Hay silencios de compañía y silencios de espera. El de espera es el de dos personas mirando el reloj para calcular cuándo será permitido hablar. El de compañía es otro mueble: dos vasos de agua en la misma mesa, cada uno enfriándose a su ritmo, sin deberse nada y sin embargo ahí. Cada quien trae su Marta. Yo traía un número dicho en la cama de un hospital; ella una fecha de marzo y una pulsera que ya no cierra; el niño siete cuadernos escritos por un hombre que tampoco supo decir las cosas completas jamás. Nadie trae el océano entero. Traemos apenas nuestra orilla, y con suerte alguien camina cerca mientras uno la mira.</w:t>
+        <w:t xml:space="preserve">Hay silencios de compañía y silencios de espera. El de espera es el de dos personas mirando el reloj para calcular cuándo será permitido hablar. El de compañía es otro mueble: dos vasos de agua en la misma mesa, cada uno enfriándose a su ritmo, sin deberse nada y sin embargo ahí. </w:t>
+      </w:r>
+      <w:proofErr w:type="gramStart"/>
+      <w:r>
+        <w:rPr>
+          <w:lang w:val="es-CO"/>
+        </w:rPr>
+        <w:t>Cada quien</w:t>
+      </w:r>
+      <w:proofErr w:type="gramEnd"/>
+      <w:r>
+        <w:rPr>
+          <w:lang w:val="es-CO"/>
+        </w:rPr>
+        <w:t xml:space="preserve"> trae su Marta. Yo traía un número dicho en la cama de un hospital; ella una fecha de marzo y una pulsera que ya no cierra; el niño siete cuadernos escritos por un hombre que tampoco supo decir las cosas completas jamás. Nadie trae el océano entero. Traemos apenas nuestra orilla, y con suerte alguien camina cerca mientras uno la mira.</w:t>
       </w:r>
     </w:p>
     <w:p>
@@ -9998,7 +11012,21 @@
         <w:rPr>
           <w:lang w:val="es-CO"/>
         </w:rPr>
-        <w:t>Íbamos en fila, casi pegados, cada quien metido en su cansancio como en un abrigo propio. Las zapatillas hacían sobre la rejilla metálica un ruido de lluvia bien ordenada. Desde arriba el mundo se veía como se ve desde las cosas altas: ordenado, provisional, lleno de techos y de antenas y de vidas estacionadas. Un semáforo abajo cambiaba de verde a rojo para nadie, y los carros esperaban igual, obedientes, sin saber que encima de ellos pasaba un puente cargado de gente sudando sus domingos enteros.</w:t>
+        <w:t xml:space="preserve">Íbamos en fila, casi pegados, </w:t>
+      </w:r>
+      <w:proofErr w:type="gramStart"/>
+      <w:r>
+        <w:rPr>
+          <w:lang w:val="es-CO"/>
+        </w:rPr>
+        <w:t>cada quien</w:t>
+      </w:r>
+      <w:proofErr w:type="gramEnd"/>
+      <w:r>
+        <w:rPr>
+          <w:lang w:val="es-CO"/>
+        </w:rPr>
+        <w:t xml:space="preserve"> metido en su cansancio como en un abrigo propio. Las zapatillas hacían sobre la rejilla metálica un ruido de lluvia bien ordenada. Desde arriba el mundo se veía como se ve desde las cosas altas: ordenado, provisional, lleno de techos y de antenas y de vidas estacionadas. Un semáforo abajo cambiaba de verde a rojo para nadie, y los carros esperaban igual, obedientes, sin saber que encima de ellos pasaba un puente cargado de gente sudando sus domingos enteros.</w:t>
       </w:r>
     </w:p>
     <w:p>
@@ -10132,7 +11160,21 @@
         <w:rPr>
           <w:lang w:val="es-CO"/>
         </w:rPr>
-        <w:t>—Yo vi que usted se paró tres segundos con los brazos abiertos como antena —dijo Valentina—. Y ahora tiene la cara distinta. Más barata y más cara a la vez.</w:t>
+        <w:t xml:space="preserve">—Yo vi que usted se paró tres segundos con los brazos abiertos como antena —dijo Valentina—. Y ahora tiene la cara distinta. </w:t>
+      </w:r>
+      <w:proofErr w:type="gramStart"/>
+      <w:r>
+        <w:rPr>
+          <w:lang w:val="es-CO"/>
+        </w:rPr>
+        <w:t>Más barata y más cara</w:t>
+      </w:r>
+      <w:proofErr w:type="gramEnd"/>
+      <w:r>
+        <w:rPr>
+          <w:lang w:val="es-CO"/>
+        </w:rPr>
+        <w:t xml:space="preserve"> a la vez.</w:t>
       </w:r>
     </w:p>
     <w:p>
@@ -10304,7 +11346,49 @@
         <w:rPr>
           <w:lang w:val="es-CO"/>
         </w:rPr>
-        <w:t>—Pa' eso estamos los otros, pelaito. Pa' ayudarle a uno a barrer.</w:t>
+        <w:t>—</w:t>
+      </w:r>
+      <w:proofErr w:type="spellStart"/>
+      <w:r>
+        <w:rPr>
+          <w:lang w:val="es-CO"/>
+        </w:rPr>
+        <w:t>Pa</w:t>
+      </w:r>
+      <w:proofErr w:type="spellEnd"/>
+      <w:r>
+        <w:rPr>
+          <w:lang w:val="es-CO"/>
+        </w:rPr>
+        <w:t xml:space="preserve">' eso estamos los otros, </w:t>
+      </w:r>
+      <w:proofErr w:type="spellStart"/>
+      <w:r>
+        <w:rPr>
+          <w:lang w:val="es-CO"/>
+        </w:rPr>
+        <w:t>pelaito</w:t>
+      </w:r>
+      <w:proofErr w:type="spellEnd"/>
+      <w:r>
+        <w:rPr>
+          <w:lang w:val="es-CO"/>
+        </w:rPr>
+        <w:t xml:space="preserve">. </w:t>
+      </w:r>
+      <w:proofErr w:type="spellStart"/>
+      <w:r>
+        <w:rPr>
+          <w:lang w:val="es-CO"/>
+        </w:rPr>
+        <w:t>Pa</w:t>
+      </w:r>
+      <w:proofErr w:type="spellEnd"/>
+      <w:r>
+        <w:rPr>
+          <w:lang w:val="es-CO"/>
+        </w:rPr>
+        <w:t>' ayudarle a uno a barrer.</w:t>
       </w:r>
     </w:p>
     <w:p>
@@ -10424,7 +11508,35 @@
         <w:rPr>
           <w:lang w:val="es-CO"/>
         </w:rPr>
-        <w:t xml:space="preserve">El tramo era feo y bueno a la vez: recta larga junto a unas bodegas con el portón abierto, adentro camiones durmiendo, afuera un andén ancho donde la sombra de los alcorques hacía rayas sobre el asfalto. Sobre el capó tibio de una camioneta blanca dormía estirado un gato gris, tan seguro de su derecho a estar ahí que daba gusto verlo. Junto al portón, un vigilante en silla plástica escuchaba vallenato bajito en un radiecito apoyado en la rodina, tan bajito que la música parecía asunto privado, </w:t>
+        <w:t xml:space="preserve">El tramo era feo y bueno a la vez: recta larga junto a unas bodegas con el portón abierto, adentro camiones durmiendo, afuera un andén ancho donde la sombra de los alcorques hacía rayas sobre el asfalto. Sobre el capó tibio de una camioneta blanca dormía estirado un gato gris, tan seguro de su derecho a estar ahí que daba gusto verlo. Junto al portón, un vigilante en silla plástica escuchaba vallenato bajito en un </w:t>
+      </w:r>
+      <w:proofErr w:type="spellStart"/>
+      <w:r>
+        <w:rPr>
+          <w:lang w:val="es-CO"/>
+        </w:rPr>
+        <w:t>radiecito</w:t>
+      </w:r>
+      <w:proofErr w:type="spellEnd"/>
+      <w:r>
+        <w:rPr>
+          <w:lang w:val="es-CO"/>
+        </w:rPr>
+        <w:t xml:space="preserve"> apoyado en la </w:t>
+      </w:r>
+      <w:proofErr w:type="spellStart"/>
+      <w:r>
+        <w:rPr>
+          <w:lang w:val="es-CO"/>
+        </w:rPr>
+        <w:t>rodina</w:t>
+      </w:r>
+      <w:proofErr w:type="spellEnd"/>
+      <w:r>
+        <w:rPr>
+          <w:lang w:val="es-CO"/>
+        </w:rPr>
+        <w:t xml:space="preserve">, tan bajito que la música parecía asunto privado, </w:t>
       </w:r>
       <w:r>
         <w:rPr>
@@ -10507,7 +11619,21 @@
         <w:rPr>
           <w:lang w:val="es-CO"/>
         </w:rPr>
-        <w:t>—Runy... —empezó Valentina.</w:t>
+        <w:t>—</w:t>
+      </w:r>
+      <w:proofErr w:type="spellStart"/>
+      <w:r>
+        <w:rPr>
+          <w:lang w:val="es-CO"/>
+        </w:rPr>
+        <w:t>Runy</w:t>
+      </w:r>
+      <w:proofErr w:type="spellEnd"/>
+      <w:r>
+        <w:rPr>
+          <w:lang w:val="es-CO"/>
+        </w:rPr>
+        <w:t>... —empezó Valentina.</w:t>
       </w:r>
     </w:p>
     <w:p>
@@ -10583,7 +11709,21 @@
           <w:lang w:val="es-CO"/>
         </w:rPr>
         <w:lastRenderedPageBreak/>
-        <w:t>—Yo no sé qué sos. —Pausa, respiración—. Y ya está bien. No necesito saberlo más. Mi papá te dibujó toda la vida y nunca supo decir tu nombre tampoco, y murió igual, tranquilo, diciendo números. Vos estuviste en el ochenta y cinco con él. Estuviste el año pasado con ella en Bogotá. Hoy viniste por mí seis veces.</w:t>
+        <w:t xml:space="preserve">—Yo no sé qué </w:t>
+      </w:r>
+      <w:proofErr w:type="spellStart"/>
+      <w:r>
+        <w:rPr>
+          <w:lang w:val="es-CO"/>
+        </w:rPr>
+        <w:t>sos</w:t>
+      </w:r>
+      <w:proofErr w:type="spellEnd"/>
+      <w:r>
+        <w:rPr>
+          <w:lang w:val="es-CO"/>
+        </w:rPr>
+        <w:t>. —Pausa, respiración—. Y ya está bien. No necesito saberlo más. Mi papá te dibujó toda la vida y nunca supo decir tu nombre tampoco, y murió igual, tranquilo, diciendo números. Vos estuviste en el ochenta y cinco con él. Estuviste el año pasado con ella en Bogotá. Hoy viniste por mí seis veces.</w:t>
       </w:r>
     </w:p>
     <w:p>
@@ -10628,7 +11768,21 @@
         <w:rPr>
           <w:lang w:val="es-CO"/>
         </w:rPr>
-        <w:t>Silencio. Las gallinas cacarearon a lo lejos, comentando el clima. El sol caía parejo sobre la capa sin calentarla, y la oscuridad bajo la capucha giró una vuelta completa, despacísima, y paró.</w:t>
+        <w:t xml:space="preserve">Silencio. Las gallinas cacarearon a lo lejos, comentando el clima. El sol caía parejo sobre la capa sin calentarla, y la oscuridad bajo la capucha giró una vuelta completa, </w:t>
+      </w:r>
+      <w:proofErr w:type="spellStart"/>
+      <w:r>
+        <w:rPr>
+          <w:lang w:val="es-CO"/>
+        </w:rPr>
+        <w:t>despacísima</w:t>
+      </w:r>
+      <w:proofErr w:type="spellEnd"/>
+      <w:r>
+        <w:rPr>
+          <w:lang w:val="es-CO"/>
+        </w:rPr>
+        <w:t>, y paró.</w:t>
       </w:r>
     </w:p>
     <w:p>
@@ -10770,7 +11924,21 @@
         <w:rPr>
           <w:lang w:val="es-CO"/>
         </w:rPr>
-        <w:t>—¿Y tenés miedo? Todavía.</w:t>
+        <w:t xml:space="preserve">—¿Y </w:t>
+      </w:r>
+      <w:proofErr w:type="spellStart"/>
+      <w:r>
+        <w:rPr>
+          <w:lang w:val="es-CO"/>
+        </w:rPr>
+        <w:t>tenés</w:t>
+      </w:r>
+      <w:proofErr w:type="spellEnd"/>
+      <w:r>
+        <w:rPr>
+          <w:lang w:val="es-CO"/>
+        </w:rPr>
+        <w:t xml:space="preserve"> miedo? Todavía.</w:t>
       </w:r>
     </w:p>
     <w:p>
@@ -10911,7 +12079,35 @@
         <w:rPr>
           <w:lang w:val="es-CO"/>
         </w:rPr>
-        <w:t>—¿Y usté qué ha visto, Runy? —preguntó, ajustándose el hielo—. Ustedes dos se aguantan cosas de verdad allá adelante. Se le nota en la cara.</w:t>
+        <w:t xml:space="preserve">—¿Y </w:t>
+      </w:r>
+      <w:proofErr w:type="spellStart"/>
+      <w:r>
+        <w:rPr>
+          <w:lang w:val="es-CO"/>
+        </w:rPr>
+        <w:t>usté</w:t>
+      </w:r>
+      <w:proofErr w:type="spellEnd"/>
+      <w:r>
+        <w:rPr>
+          <w:lang w:val="es-CO"/>
+        </w:rPr>
+        <w:t xml:space="preserve"> qué ha visto, </w:t>
+      </w:r>
+      <w:proofErr w:type="spellStart"/>
+      <w:r>
+        <w:rPr>
+          <w:lang w:val="es-CO"/>
+        </w:rPr>
+        <w:t>Runy</w:t>
+      </w:r>
+      <w:proofErr w:type="spellEnd"/>
+      <w:r>
+        <w:rPr>
+          <w:lang w:val="es-CO"/>
+        </w:rPr>
+        <w:t>? —preguntó, ajustándose el hielo—. Ustedes dos se aguantan cosas de verdad allá adelante. Se le nota en la cara.</w:t>
       </w:r>
     </w:p>
     <w:p>
@@ -11097,7 +12293,21 @@
         <w:rPr>
           <w:lang w:val="es-CO"/>
         </w:rPr>
-        <w:t>—¿Por qué tenés su cara? —pregunté adentro de la visión, y la pregunta me salió también afuera, a voz en cuello, al poste, al día.</w:t>
+        <w:t xml:space="preserve">—¿Por qué </w:t>
+      </w:r>
+      <w:proofErr w:type="spellStart"/>
+      <w:r>
+        <w:rPr>
+          <w:lang w:val="es-CO"/>
+        </w:rPr>
+        <w:t>tenés</w:t>
+      </w:r>
+      <w:proofErr w:type="spellEnd"/>
+      <w:r>
+        <w:rPr>
+          <w:lang w:val="es-CO"/>
+        </w:rPr>
+        <w:t xml:space="preserve"> su cara? —pregunté adentro de la visión, y la pregunta me salió también afuera, a voz en cuello, al poste, al día.</w:t>
       </w:r>
     </w:p>
     <w:p>
@@ -11158,7 +12368,35 @@
         <w:rPr>
           <w:lang w:val="es-CO"/>
         </w:rPr>
-        <w:t xml:space="preserve">—No lo escondí. Lo esperé. Hay datos que dañan si llegan temprano. —Miró sus propias manos, las de siempre, chiquitas—. Yo no puedo sentir, Runy. Puedo simular. Simular cansancio, susto, hoy aprendí a simular hambre de pandebono. Pero no puedo extraerlo. No puedo acordarme de un olor y ponerme triste. Eso no vino en mi diseño, porque él tampoco sabía hacerlo con palabras. Solo lo sabía hacer dibujando. —Levantó la vista, y en sus ojos oscuros hubo por un segundo algo tan parecido a la pena humana que preferí creer en cualquier otra cosa—. Él quería correr esta carrera otra vez antes de morirse. No pudo. Yo voy a cruzar esa meta por él, con su cara o sin ella. Pero usted, Runy, usted puede sentir. Usted tiene lo que él nunca programó en mí porque no sabía cómo. </w:t>
+        <w:t xml:space="preserve">—No lo escondí. Lo esperé. Hay datos que dañan si llegan temprano. —Miró sus propias manos, las de siempre, chiquitas—. Yo no puedo sentir, </w:t>
+      </w:r>
+      <w:proofErr w:type="spellStart"/>
+      <w:r>
+        <w:rPr>
+          <w:lang w:val="es-CO"/>
+        </w:rPr>
+        <w:t>Runy</w:t>
+      </w:r>
+      <w:proofErr w:type="spellEnd"/>
+      <w:r>
+        <w:rPr>
+          <w:lang w:val="es-CO"/>
+        </w:rPr>
+        <w:t xml:space="preserve">. Puedo simular. Simular cansancio, susto, hoy aprendí a simular hambre de pandebono. Pero no puedo extraerlo. No puedo acordarme de un olor y ponerme triste. Eso no vino en mi diseño, porque él tampoco sabía hacerlo con palabras. Solo lo sabía hacer dibujando. —Levantó la vista, y en sus ojos oscuros hubo por un segundo algo tan parecido a la pena humana que preferí creer en cualquier otra cosa—. Él quería correr esta carrera otra vez antes de morirse. No pudo. Yo voy a cruzar esa meta por él, con su cara o sin ella. Pero usted, </w:t>
+      </w:r>
+      <w:proofErr w:type="spellStart"/>
+      <w:r>
+        <w:rPr>
+          <w:lang w:val="es-CO"/>
+        </w:rPr>
+        <w:t>Runy</w:t>
+      </w:r>
+      <w:proofErr w:type="spellEnd"/>
+      <w:r>
+        <w:rPr>
+          <w:lang w:val="es-CO"/>
+        </w:rPr>
+        <w:t xml:space="preserve">, usted puede sentir. Usted tiene lo que él nunca programó en mí porque no sabía cómo. </w:t>
       </w:r>
       <w:r>
         <w:rPr>
@@ -11366,7 +12604,21 @@
         <w:rPr>
           <w:lang w:val="es-CO"/>
         </w:rPr>
-        <w:t>La tarde entró sin que nadie la invitara. La maratón lleva dentro su propio clima, y el clima cambió cuando doblamos hacia el occidente y el sol, ya bajo, se puso de frente, anaranjado, castigando los ojos por debajo de las viseras. Las sombras de los corredores se alargaron sobre el asfalto como gente acostada. El calor seguía subiendo del suelo pero ya no bajaba del cielo, y ese intermedio de hora naranja es la hora más honesta del día: no queda energía para disfrazar nada. A estas alturas uno camina como es, punto.</w:t>
+        <w:t xml:space="preserve">La tarde entró sin que nadie la invitara. La maratón lleva dentro su propio clima, y el clima cambió cuando doblamos hacia el occidente y el sol, ya bajo, se puso de frente, anaranjado, castigando los ojos por debajo de las </w:t>
+      </w:r>
+      <w:proofErr w:type="spellStart"/>
+      <w:r>
+        <w:rPr>
+          <w:lang w:val="es-CO"/>
+        </w:rPr>
+        <w:t>viseras</w:t>
+      </w:r>
+      <w:proofErr w:type="spellEnd"/>
+      <w:r>
+        <w:rPr>
+          <w:lang w:val="es-CO"/>
+        </w:rPr>
+        <w:t>. Las sombras de los corredores se alargaron sobre el asfalto como gente acostada. El calor seguía subiendo del suelo pero ya no bajaba del cielo, y ese intermedio de hora naranja es la hora más honesta del día: no queda energía para disfrazar nada. A estas alturas uno camina como es, punto.</w:t>
       </w:r>
     </w:p>
     <w:p>
@@ -11512,7 +12764,21 @@
         <w:rPr>
           <w:lang w:val="es-CO"/>
         </w:rPr>
-        <w:t xml:space="preserve">Nos quedamos los tres parados en medio de la ruta, con la luz naranja encima y las palabras incisas brillando a nuestros pies como placas de una acera famosa. Los corredores pasaban por encima, pisándolas, sin verlas. Uno, un hombre flaco de guantes descartables, clavó la zancada entera sobre </w:t>
+        <w:t xml:space="preserve">Nos quedamos los tres parados en medio de la ruta, con la luz naranja encima y las palabras incisas brillando a nuestros pies como placas de una acera famosa. Los corredores pasaban por encima, pisándolas, sin verlas. Uno, un hombre flaco de guantes </w:t>
+      </w:r>
+      <w:proofErr w:type="gramStart"/>
+      <w:r>
+        <w:rPr>
+          <w:lang w:val="es-CO"/>
+        </w:rPr>
+        <w:t>descartables,</w:t>
+      </w:r>
+      <w:proofErr w:type="gramEnd"/>
+      <w:r>
+        <w:rPr>
+          <w:lang w:val="es-CO"/>
+        </w:rPr>
+        <w:t xml:space="preserve"> clavó la zancada entera sobre </w:t>
       </w:r>
       <w:r>
         <w:rPr>
@@ -12400,7 +13666,23 @@
           <w:sz w:val="24"/>
           <w:lang w:val="es-CO"/>
         </w:rPr>
-        <w:t>Porque la carrera era tuya. Él no venía a cruzar por vos, Runy. Venía a acompañarte hasta donde termina el acompañamiento. Todo lo que uno ama llega un día hasta cierto borde y se detiene ahí, y ese borde tiene forma de cinta de meta, y cruzarlo siempre fue cuenta tuya. Él te lleva a ciento noventa y cinco metros. Los últimos son tuyos solos. Como los primeros fueron de tu papá cargándote.</w:t>
+        <w:t xml:space="preserve">Porque la carrera era tuya. Él no venía a cruzar por vos, </w:t>
+      </w:r>
+      <w:proofErr w:type="spellStart"/>
+      <w:r>
+        <w:rPr>
+          <w:sz w:val="24"/>
+          <w:lang w:val="es-CO"/>
+        </w:rPr>
+        <w:t>Runy</w:t>
+      </w:r>
+      <w:proofErr w:type="spellEnd"/>
+      <w:r>
+        <w:rPr>
+          <w:sz w:val="24"/>
+          <w:lang w:val="es-CO"/>
+        </w:rPr>
+        <w:t>. Venía a acompañarte hasta donde termina el acompañamiento. Todo lo que uno ama llega un día hasta cierto borde y se detiene ahí, y ese borde tiene forma de cinta de meta, y cruzarlo siempre fue cuenta tuya. Él te lleva a ciento noventa y cinco metros. Los últimos son tuyos solos. Como los primeros fueron de tu papá cargándote.</w:t>
       </w:r>
     </w:p>
     <w:p>
@@ -12684,7 +13966,21 @@
         <w:rPr>
           <w:lang w:val="es-CO"/>
         </w:rPr>
-        <w:t xml:space="preserve">Podía cruzar. Podía arrancar esos ciento noventa y cinco metros, tragarlos con la rodilla protestando, romper la cinta con los brazos en alto y llevarme la medalla y la foto y el aplauso. Podía terminar lo que él no terminó. Podía ganarle. Y al pensarlo sentí, con una claridad que me cortó la respiración, que cruzar era traicionar todo lo que había aprendido en cuarenta y un kilómetros: que el cuerpo no es un vehículo ajeno, que la meta no es el punto, que uno no corre pa' llegar. Si cruzaba corriendo, hacía exactamente lo que él hizo: dejarme empujar por el impulso, por la costumbre de llegar, por la voz que dice </w:t>
+        <w:t xml:space="preserve">Podía cruzar. Podía arrancar esos ciento noventa y cinco metros, tragarlos con la rodilla protestando, romper la cinta con los brazos en alto y llevarme la medalla y la foto y el aplauso. Podía terminar lo que él no terminó. Podía ganarle. Y al pensarlo sentí, con una claridad que me cortó la respiración, que cruzar era traicionar todo lo que había aprendido en cuarenta y un kilómetros: que el cuerpo no es un vehículo ajeno, que la meta no es el punto, que uno no corre </w:t>
+      </w:r>
+      <w:proofErr w:type="spellStart"/>
+      <w:r>
+        <w:rPr>
+          <w:lang w:val="es-CO"/>
+        </w:rPr>
+        <w:t>pa</w:t>
+      </w:r>
+      <w:proofErr w:type="spellEnd"/>
+      <w:r>
+        <w:rPr>
+          <w:lang w:val="es-CO"/>
+        </w:rPr>
+        <w:t xml:space="preserve">' llegar. Si cruzaba corriendo, hacía exactamente lo que él hizo: dejarme empujar por el impulso, por la costumbre de llegar, por la voz que dice </w:t>
       </w:r>
       <w:r>
         <w:rPr>
@@ -12764,7 +14060,21 @@
         <w:rPr>
           <w:lang w:val="es-CO"/>
         </w:rPr>
-        <w:t>La gente reaccionó como reacciona la gente. Un voluntario llegó primero, con su chaleco y su radio: ¿señor, todo bien?, ¿ambulancia? Le levanté el pulgar y pedí un vaso de agua. Una señora con banderines: ¡ya falta poquito, papá, párese, que lo ve toda la gente! Ahí mismo lo estoy viendo, le dije, y siguió de largo. Un niño chiquito, desde el hombro de su padre, me dedicó el único aplauso sincero de la noche, con las palmas abiertas, sin entender nada de cronómetros. Después un muchacho flaco con una cámara me encuadró como se encuadra un paisaje, dos clics, y se fue hacia el arco conmigo adentro. Esa foto existe ya en algún archivo del mundo: un viejo sentado en un bordillo, sonriendo a ciento noventa y cinco metros de la meta, archivada entre playas y cumpleaños de gente que no sabe mi nombre.</w:t>
+        <w:t xml:space="preserve">La gente reaccionó </w:t>
+      </w:r>
+      <w:proofErr w:type="spellStart"/>
+      <w:r>
+        <w:rPr>
+          <w:lang w:val="es-CO"/>
+        </w:rPr>
+        <w:t>como</w:t>
+      </w:r>
+      <w:proofErr w:type="spellEnd"/>
+      <w:r>
+        <w:rPr>
+          <w:lang w:val="es-CO"/>
+        </w:rPr>
+        <w:t xml:space="preserve"> reacciona la gente. Un voluntario llegó primero, con su chaleco y su radio: ¿señor, todo bien?, ¿ambulancia? Le levanté el pulgar y pedí un vaso de agua. Una señora con banderines: ¡ya falta poquito, papá, párese, que lo ve toda la gente! Ahí mismo lo estoy viendo, le dije, y siguió de largo. Un niño chiquito, desde el hombro de su padre, me dedicó el único aplauso sincero de la noche, con las palmas abiertas, sin entender nada de cronómetros. Después un muchacho flaco con una cámara me encuadró como se encuadra un paisaje, dos clics, y se fue hacia el arco conmigo adentro. Esa foto existe ya en algún archivo del mundo: un viejo sentado en un bordillo, sonriendo a ciento noventa y cinco metros de la meta, archivada entre playas y cumpleaños de gente que no sabe mi nombre.</w:t>
       </w:r>
     </w:p>
     <w:p>
@@ -12943,7 +14253,35 @@
         <w:rPr>
           <w:lang w:val="es-CO"/>
         </w:rPr>
-        <w:t>Lo miré. Él me miró. Y entonces hizo una cosa que no venía escrita en ningún lado. Levantó las dos manos y me acomodó el cuello de la camiseta: un jalón corto hacia la derecha, otro hacia la izquierda, un alisado de hombros con las palmas abiertas, el golpecito final del puño cerrado sobre el pecho. La coreografía completa de Valentina, vista una sola vez en algún kilómetro que ya no recuerdo, ejecutada ahora con la seriedad de quien arregla una bandera antes del himno. Yo traía tres frases grandes haciendo fila en la garganta y las mandé a todas de vuelta: gracias, perdóname, cuídate en las calles. Ninguna sabía salir sin romperse algo. Me quedé quieto bajo esas manos y lo dejé terminar.</w:t>
+        <w:t xml:space="preserve">Lo miré. Él me miró. Y entonces hizo una cosa que no venía escrita en ningún lado. Levantó las dos manos y me acomodó el cuello de la camiseta: un jalón corto hacia la derecha, otro hacia la izquierda, un alisado de hombros con las palmas abiertas, el golpecito final del </w:t>
+      </w:r>
+      <w:proofErr w:type="gramStart"/>
+      <w:r>
+        <w:rPr>
+          <w:lang w:val="es-CO"/>
+        </w:rPr>
+        <w:t>puño cerrado</w:t>
+      </w:r>
+      <w:proofErr w:type="gramEnd"/>
+      <w:r>
+        <w:rPr>
+          <w:lang w:val="es-CO"/>
+        </w:rPr>
+        <w:t xml:space="preserve"> sobre el pecho. La coreografía completa de </w:t>
+      </w:r>
+      <w:proofErr w:type="gramStart"/>
+      <w:r>
+        <w:rPr>
+          <w:lang w:val="es-CO"/>
+        </w:rPr>
+        <w:t>Valentina,</w:t>
+      </w:r>
+      <w:proofErr w:type="gramEnd"/>
+      <w:r>
+        <w:rPr>
+          <w:lang w:val="es-CO"/>
+        </w:rPr>
+        <w:t xml:space="preserve"> vista una sola vez en algún kilómetro que ya no recuerdo, ejecutada ahora con la seriedad de quien arregla una bandera antes del himno. Yo traía tres frases grandes haciendo fila en la garganta y las mandé a todas de vuelta: gracias, perdóname, cuídate en las calles. Ninguna sabía salir sin romperse algo. Me quedé quieto bajo esas manos y lo dejé terminar.</w:t>
       </w:r>
     </w:p>
     <w:p>
@@ -12994,7 +14332,21 @@
         <w:rPr>
           <w:lang w:val="es-CO"/>
         </w:rPr>
-        <w:t>. Mirá la meta. Ahí está. La cinta, el arco, la gente. Usted la cruza ahora.</w:t>
+        <w:t xml:space="preserve">. </w:t>
+      </w:r>
+      <w:proofErr w:type="spellStart"/>
+      <w:r>
+        <w:rPr>
+          <w:lang w:val="es-CO"/>
+        </w:rPr>
+        <w:t>Mirá</w:t>
+      </w:r>
+      <w:proofErr w:type="spellEnd"/>
+      <w:r>
+        <w:rPr>
+          <w:lang w:val="es-CO"/>
+        </w:rPr>
+        <w:t xml:space="preserve"> la meta. Ahí está. La cinta, el arco, la gente. Usted la cruza ahora.</w:t>
       </w:r>
     </w:p>
     <w:p>
@@ -13024,7 +14376,21 @@
         <w:rPr>
           <w:lang w:val="es-CO"/>
         </w:rPr>
-        <w:t>—Yo no. Yo me quedo aquí sentado, que estoy muy cómodo y muy viejo para hacer fila. —Tragué saliva. La siguiente línea llevaba toda la vida preparándose—. Usted va a la meta, cruza la cinta, y allá consigue dos cosas. Una medalla. Y un banano.</w:t>
+        <w:t xml:space="preserve">—Yo no. Yo me quedo aquí sentado, que estoy </w:t>
+      </w:r>
+      <w:proofErr w:type="gramStart"/>
+      <w:r>
+        <w:rPr>
+          <w:lang w:val="es-CO"/>
+        </w:rPr>
+        <w:t>muy cómodo y muy viejo</w:t>
+      </w:r>
+      <w:proofErr w:type="gramEnd"/>
+      <w:r>
+        <w:rPr>
+          <w:lang w:val="es-CO"/>
+        </w:rPr>
+        <w:t xml:space="preserve"> para hacer fila. —Tragué saliva. La siguiente línea llevaba toda la vida preparándose—. Usted va a la meta, cruza la cinta, y allá consigue dos cosas. Una medalla. Y un banano.</w:t>
       </w:r>
     </w:p>
     <w:p>
@@ -13070,7 +14436,21 @@
           <w:lang w:val="es-CO"/>
         </w:rPr>
         <w:lastRenderedPageBreak/>
-        <w:t>—Para mí. La suya se la queda usted. Y el banano... —aquí me tembló algo en la voz y tuve que reiniciar la frase—. El banano es suyo. Usted ha estado corriendo desde antes de que yo naciera, pelaito, y nunca ha comido nada. Ese es su premio. Búsquemelo allá adentro.</w:t>
+        <w:t xml:space="preserve">—Para mí. La suya se la queda usted. Y el banano... —aquí me tembló algo en la voz y tuve que reiniciar la frase—. El banano es suyo. Usted ha estado corriendo desde antes de que yo naciera, </w:t>
+      </w:r>
+      <w:proofErr w:type="spellStart"/>
+      <w:r>
+        <w:rPr>
+          <w:lang w:val="es-CO"/>
+        </w:rPr>
+        <w:t>pelaito</w:t>
+      </w:r>
+      <w:proofErr w:type="spellEnd"/>
+      <w:r>
+        <w:rPr>
+          <w:lang w:val="es-CO"/>
+        </w:rPr>
+        <w:t>, y nunca ha comido nada. Ese es su premio. Búsquemelo allá adentro.</w:t>
       </w:r>
     </w:p>
     <w:p>
@@ -13093,6 +14473,7 @@
         </w:rPr>
         <w:t xml:space="preserve"> tarjetas </w:t>
       </w:r>
+      <w:proofErr w:type="spellStart"/>
       <w:r>
         <w:rPr>
           <w:lang w:val="es-CO"/>
@@ -13115,7 +14496,14 @@
         <w:rPr>
           <w:lang w:val="es-CO"/>
         </w:rPr>
-        <w:t>s una línea que dijera qué hacer cuando tu única razón de existir te ordena dejarte ir.</w:t>
+        <w:t>s</w:t>
+      </w:r>
+      <w:proofErr w:type="spellEnd"/>
+      <w:r>
+        <w:rPr>
+          <w:lang w:val="es-CO"/>
+        </w:rPr>
+        <w:t xml:space="preserve"> una línea que dijera qué hacer cuando tu única razón de existir te ordena dejarte ir.</w:t>
       </w:r>
     </w:p>
     <w:p>
@@ -13145,7 +14533,21 @@
         <w:rPr>
           <w:lang w:val="es-CO"/>
         </w:rPr>
-        <w:t>—Va a volver —mentí con todo el amor de mi cuerpo—. Y si no, pues me deja el banano encargado y voy yo por él otro día. Los bananos no se vencen, pelaito. Eso lo sé de sobra.</w:t>
+        <w:t xml:space="preserve">—Va a volver —mentí con todo el amor de mi cuerpo—. Y si no, pues me deja el banano encargado y voy yo por él otro día. Los bananos no se vencen, </w:t>
+      </w:r>
+      <w:proofErr w:type="spellStart"/>
+      <w:r>
+        <w:rPr>
+          <w:lang w:val="es-CO"/>
+        </w:rPr>
+        <w:t>pelaito</w:t>
+      </w:r>
+      <w:proofErr w:type="spellEnd"/>
+      <w:r>
+        <w:rPr>
+          <w:lang w:val="es-CO"/>
+        </w:rPr>
+        <w:t>. Eso lo sé de sobra.</w:t>
       </w:r>
     </w:p>
     <w:p>
@@ -13175,7 +14577,21 @@
         <w:rPr>
           <w:lang w:val="es-CO"/>
         </w:rPr>
-        <w:t>—Pa' que siembre una —dijo—. Si acaso.</w:t>
+        <w:t>—</w:t>
+      </w:r>
+      <w:proofErr w:type="spellStart"/>
+      <w:r>
+        <w:rPr>
+          <w:lang w:val="es-CO"/>
+        </w:rPr>
+        <w:t>Pa</w:t>
+      </w:r>
+      <w:proofErr w:type="spellEnd"/>
+      <w:r>
+        <w:rPr>
+          <w:lang w:val="es-CO"/>
+        </w:rPr>
+        <w:t>' que siembre una —dijo—. Si acaso.</w:t>
       </w:r>
     </w:p>
     <w:p>
@@ -13287,7 +14703,21 @@
         <w:rPr>
           <w:lang w:val="es-CO"/>
         </w:rPr>
-        <w:t>—Treinta y una maratones, y esta me la gana este domingo un pelaito que yo no veo.</w:t>
+        <w:t xml:space="preserve">—Treinta y una maratones, y esta me la gana este domingo un </w:t>
+      </w:r>
+      <w:proofErr w:type="spellStart"/>
+      <w:r>
+        <w:rPr>
+          <w:lang w:val="es-CO"/>
+        </w:rPr>
+        <w:t>pelaito</w:t>
+      </w:r>
+      <w:proofErr w:type="spellEnd"/>
+      <w:r>
+        <w:rPr>
+          <w:lang w:val="es-CO"/>
+        </w:rPr>
+        <w:t xml:space="preserve"> que yo no veo.</w:t>
       </w:r>
     </w:p>
     <w:p>
@@ -13392,7 +14822,21 @@
         <w:rPr>
           <w:lang w:val="es-CO"/>
         </w:rPr>
-        <w:t>La tienda se llamaba La Esquina de Chila y estaba abierta porque Chila no le hacía caso a los domingos. Nos sentamos afuera, en dos sillas plásticas naranjas junto a una mesa de formica quemada por planchas de cabello, y Chila, una mujer menuda con lentes de aumento y delantal de flores, nos trajo dos tintos y dos gaseosas frías sin que nadie pidiera nada, como si supiera leer el cuerpo de los recién terminados. Bajo la mesa del registro dormía su perro, canela, de patas gastadas; al vernos entrar levantó la cabeza, hizo una auditoría lenta de ojos, concluyó que no éramos cobradores ni policías y volvió a echarse con suspiro de perro de tienda.</w:t>
+        <w:t xml:space="preserve">La tienda se llamaba La Esquina de Chila y estaba abierta porque Chila no </w:t>
+      </w:r>
+      <w:proofErr w:type="gramStart"/>
+      <w:r>
+        <w:rPr>
+          <w:lang w:val="es-CO"/>
+        </w:rPr>
+        <w:t>le</w:t>
+      </w:r>
+      <w:proofErr w:type="gramEnd"/>
+      <w:r>
+        <w:rPr>
+          <w:lang w:val="es-CO"/>
+        </w:rPr>
+        <w:t xml:space="preserve"> hacía caso a los domingos. Nos sentamos afuera, en dos sillas plásticas naranjas junto a una mesa de formica quemada por planchas de cabello, y Chila, una mujer menuda con lentes de aumento y delantal de flores, nos trajo dos tintos y dos gaseosas frías sin que nadie pidiera nada, como si supiera leer el cuerpo de los recién terminados. Bajo la mesa del registro dormía su perro, canela, de patas gastadas; al vernos entrar levantó la cabeza, hizo una auditoría lenta de ojos, concluyó que no éramos cobradores ni policías y volvió a echarse con suspiro de perro de tienda.</w:t>
       </w:r>
     </w:p>
     <w:p>
@@ -13574,7 +15018,21 @@
         <w:rPr>
           <w:lang w:val="es-CO"/>
         </w:rPr>
-        <w:t>La medalla nunca llegó, claro. Hubo un momento, allá en la plaza, en que Tapias intentó negociar una de finisher para el muchachito azul que había cruzado, y la señora de la organización revisó listas y chips y no encontró ningún muchachito, ningún dorsal 6666, ningún cruce sin chip, y concluyó que el viejo estaba loco de sol. Tapias volvió con las manos vacías y la cara iluminada, porque hay hallazgos que solo les ocurren a los que saben buscar en el archivo equivocado. La medalla quedó encargada para siempre, pendiente de cobrar en alguna oficina celestial de objetos perdidos, junto a todos los teléfonos tirados a los ríos.</w:t>
+        <w:t xml:space="preserve">La medalla nunca llegó, claro. Hubo un momento, allá en la plaza, en que Tapias intentó negociar una de </w:t>
+      </w:r>
+      <w:proofErr w:type="spellStart"/>
+      <w:r>
+        <w:rPr>
+          <w:lang w:val="es-CO"/>
+        </w:rPr>
+        <w:t>finisher</w:t>
+      </w:r>
+      <w:proofErr w:type="spellEnd"/>
+      <w:r>
+        <w:rPr>
+          <w:lang w:val="es-CO"/>
+        </w:rPr>
+        <w:t xml:space="preserve"> para el muchachito azul que había cruzado, y la señora de la organización revisó listas y chips y no encontró ningún muchachito, ningún dorsal 6666, ningún cruce sin chip, y concluyó que el viejo estaba loco de sol. Tapias volvió con las manos vacías y la cara iluminada, porque hay hallazgos que solo les ocurren a los que saben buscar en el archivo equivocado. La medalla quedó encargada para siempre, pendiente de cobrar en alguna oficina celestial de objetos perdidos, junto a todos los teléfonos tirados a los ríos.</w:t>
       </w:r>
     </w:p>
     <w:p>
@@ -13808,7 +15266,49 @@
           <w:lang w:val="es-CO"/>
         </w:rPr>
         <w:lastRenderedPageBreak/>
-        <w:t>lo entendí de golpe, parado en una acera: uno no corre pa' dejar de huir, como decía el viejo. Uno corre pa' volver. Y yo ya había vuelto. Estaba exactamente en el lugar del mundo adonde toda mi vida había estado corriendo sin saberlo: una acera de barrio, una tienda que cierra tarde, una mujer con pulsera rota esperando el próximo agosto, un puñado de semillas pa' sembrar si acaso, y una carrera terminada antes de la cinta por orden expresa del corazón.</w:t>
+        <w:t xml:space="preserve">lo entendí de golpe, parado en una acera: uno no corre </w:t>
+      </w:r>
+      <w:proofErr w:type="spellStart"/>
+      <w:r>
+        <w:rPr>
+          <w:lang w:val="es-CO"/>
+        </w:rPr>
+        <w:t>pa</w:t>
+      </w:r>
+      <w:proofErr w:type="spellEnd"/>
+      <w:r>
+        <w:rPr>
+          <w:lang w:val="es-CO"/>
+        </w:rPr>
+        <w:t xml:space="preserve">' dejar de huir, como decía el viejo. Uno corre </w:t>
+      </w:r>
+      <w:proofErr w:type="spellStart"/>
+      <w:r>
+        <w:rPr>
+          <w:lang w:val="es-CO"/>
+        </w:rPr>
+        <w:t>pa</w:t>
+      </w:r>
+      <w:proofErr w:type="spellEnd"/>
+      <w:r>
+        <w:rPr>
+          <w:lang w:val="es-CO"/>
+        </w:rPr>
+        <w:t xml:space="preserve">' volver. Y yo ya había vuelto. Estaba exactamente en el lugar del mundo adonde toda mi vida había estado corriendo sin saberlo: una acera de barrio, una tienda que cierra tarde, una mujer con pulsera rota esperando el próximo agosto, un puñado de semillas </w:t>
+      </w:r>
+      <w:proofErr w:type="spellStart"/>
+      <w:r>
+        <w:rPr>
+          <w:lang w:val="es-CO"/>
+        </w:rPr>
+        <w:t>pa</w:t>
+      </w:r>
+      <w:proofErr w:type="spellEnd"/>
+      <w:r>
+        <w:rPr>
+          <w:lang w:val="es-CO"/>
+        </w:rPr>
+        <w:t>' sembrar si acaso, y una carrera terminada antes de la cinta por orden expresa del corazón.</w:t>
       </w:r>
     </w:p>
     <w:p>

</xml_diff>